<commit_message>
SF-030-DEV – Añadir kilómetros a metros
</commit_message>
<xml_diff>
--- a/Plantilla Testing.docx
+++ b/Plantilla Testing.docx
@@ -7,6 +7,10 @@
         <w:pStyle w:val="Normal"/>
         <w:rPr>
           <w:rFonts w:ascii="Arial" w:hAnsi="Arial"/>
+          <w:i w:val="false"/>
+          <w:i w:val="false"/>
+          <w:iCs w:val="false"/>
+          <w:color w:val="000000"/>
           <w:sz w:val="24"/>
           <w:szCs w:val="24"/>
         </w:rPr>
@@ -16,6 +20,9 @@
           <w:rFonts w:ascii="Arial" w:hAnsi="Arial"/>
           <w:b/>
           <w:bCs/>
+          <w:i w:val="false"/>
+          <w:iCs w:val="false"/>
+          <w:color w:val="000000"/>
           <w:sz w:val="24"/>
           <w:szCs w:val="24"/>
           <w:u w:val="single"/>
@@ -36,7 +43,7 @@
           <w:bottom w:w="0" w:type="dxa"/>
           <w:right w:w="108" w:type="dxa"/>
         </w:tblCellMar>
-        <w:tblLook w:val="04a0" w:noHBand="0" w:noVBand="1" w:firstColumn="1" w:lastRow="0" w:lastColumn="0" w:firstRow="1"/>
+        <w:tblLook w:firstRow="1" w:noVBand="1" w:lastRow="0" w:firstColumn="1" w:lastColumn="0" w:noHBand="0" w:val="04a0"/>
       </w:tblPr>
       <w:tblGrid>
         <w:gridCol w:w="2404"/>
@@ -57,16 +64,21 @@
               <w:spacing w:lineRule="auto" w:line="240" w:before="0" w:after="0"/>
               <w:jc w:val="left"/>
               <w:rPr>
-                <w:rFonts w:ascii="Arial" w:hAnsi="Arial" w:eastAsia="Aptos" w:cs=""/>
-                <w:kern w:val="2"/>
-                <w:sz w:val="24"/>
-                <w:szCs w:val="24"/>
-                <w:lang w:val="es-ES" w:eastAsia="en-US" w:bidi="ar-SA"/>
-              </w:rPr>
-            </w:pPr>
-            <w:r>
-              <w:rPr>
-                <w:rFonts w:eastAsia="Aptos" w:cs="" w:ascii="Arial" w:hAnsi="Arial"/>
+                <w:rFonts w:ascii="Arial" w:hAnsi="Arial"/>
+                <w:i w:val="false"/>
+                <w:i w:val="false"/>
+                <w:iCs w:val="false"/>
+                <w:color w:val="000000"/>
+                <w:sz w:val="24"/>
+                <w:szCs w:val="24"/>
+              </w:rPr>
+            </w:pPr>
+            <w:r>
+              <w:rPr>
+                <w:rFonts w:eastAsia="Aptos" w:cs="" w:ascii="Arial" w:hAnsi="Arial"/>
+                <w:i w:val="false"/>
+                <w:iCs w:val="false"/>
+                <w:color w:val="000000"/>
                 <w:kern w:val="2"/>
                 <w:sz w:val="24"/>
                 <w:szCs w:val="24"/>
@@ -83,28 +95,59 @@
           </w:tcPr>
           <w:p>
             <w:pPr>
-              <w:pStyle w:val="Normal"/>
+              <w:pStyle w:val="Heading1"/>
               <w:widowControl w:val="false"/>
               <w:suppressAutoHyphens w:val="true"/>
               <w:spacing w:lineRule="auto" w:line="240" w:before="0" w:after="0"/>
               <w:jc w:val="left"/>
               <w:rPr>
-                <w:rFonts w:ascii="Arial" w:hAnsi="Arial" w:eastAsia="Aptos" w:cs=""/>
-                <w:kern w:val="2"/>
-                <w:sz w:val="24"/>
-                <w:szCs w:val="24"/>
-                <w:lang w:val="es-ES" w:eastAsia="en-US" w:bidi="ar-SA"/>
-              </w:rPr>
-            </w:pPr>
-            <w:r>
-              <w:rPr>
-                <w:rFonts w:eastAsia="Aptos" w:cs="" w:ascii="Arial" w:hAnsi="Arial"/>
-                <w:kern w:val="2"/>
-                <w:sz w:val="24"/>
-                <w:szCs w:val="24"/>
-                <w:lang w:val="es-ES" w:eastAsia="en-US" w:bidi="ar-SA"/>
-              </w:rPr>
-              <w:t>SF-002-DEV-Añadir área de triangulo</w:t>
+                <w:rFonts w:ascii="Arial" w:hAnsi="Arial"/>
+                <w:i w:val="false"/>
+                <w:i w:val="false"/>
+                <w:iCs w:val="false"/>
+                <w:color w:val="000000"/>
+                <w:sz w:val="24"/>
+                <w:szCs w:val="24"/>
+              </w:rPr>
+            </w:pPr>
+            <w:r>
+              <w:rPr>
+                <w:rFonts w:eastAsia="Aptos" w:cs="" w:ascii="Arial" w:hAnsi="Arial"/>
+                <w:i w:val="false"/>
+                <w:iCs w:val="false"/>
+                <w:color w:val="000000"/>
+                <w:kern w:val="2"/>
+                <w:sz w:val="24"/>
+                <w:szCs w:val="24"/>
+                <w:lang w:val="es-ES" w:eastAsia="en-US" w:bidi="ar-SA"/>
+              </w:rPr>
+              <w:t>SF-030-</w:t>
+            </w:r>
+            <w:r>
+              <w:rPr>
+                <w:rFonts w:eastAsia="Aptos" w:cs="" w:ascii="Arial" w:hAnsi="Arial"/>
+                <w:i w:val="false"/>
+                <w:iCs w:val="false"/>
+                <w:color w:val="000000"/>
+                <w:kern w:val="2"/>
+                <w:sz w:val="24"/>
+                <w:szCs w:val="24"/>
+                <w:lang w:val="es-ES" w:eastAsia="en-US" w:bidi="ar-SA"/>
+              </w:rPr>
+              <w:t>TEST</w:t>
+            </w:r>
+            <w:r>
+              <w:rPr>
+                <w:rFonts w:eastAsia="Aptos" w:cs="" w:ascii="Arial" w:hAnsi="Arial"/>
+                <w:i w:val="false"/>
+                <w:iCs w:val="false"/>
+                <w:color w:val="000000"/>
+                <w:kern w:val="2"/>
+                <w:sz w:val="24"/>
+                <w:szCs w:val="24"/>
+                <w:lang w:val="es-ES" w:eastAsia="en-US" w:bidi="ar-SA"/>
+              </w:rPr>
+              <w:t xml:space="preserve"> – Añadir kilómetros a metros</w:t>
             </w:r>
           </w:p>
         </w:tc>
@@ -124,16 +167,21 @@
               <w:spacing w:lineRule="auto" w:line="240" w:before="0" w:after="0"/>
               <w:jc w:val="left"/>
               <w:rPr>
-                <w:rFonts w:ascii="Arial" w:hAnsi="Arial" w:eastAsia="Aptos" w:cs=""/>
-                <w:kern w:val="2"/>
-                <w:sz w:val="24"/>
-                <w:szCs w:val="24"/>
-                <w:lang w:val="es-ES" w:eastAsia="en-US" w:bidi="ar-SA"/>
-              </w:rPr>
-            </w:pPr>
-            <w:r>
-              <w:rPr>
-                <w:rFonts w:eastAsia="Aptos" w:cs="" w:ascii="Arial" w:hAnsi="Arial"/>
+                <w:rFonts w:ascii="Arial" w:hAnsi="Arial"/>
+                <w:i w:val="false"/>
+                <w:i w:val="false"/>
+                <w:iCs w:val="false"/>
+                <w:color w:val="000000"/>
+                <w:sz w:val="24"/>
+                <w:szCs w:val="24"/>
+              </w:rPr>
+            </w:pPr>
+            <w:r>
+              <w:rPr>
+                <w:rFonts w:eastAsia="Aptos" w:cs="" w:ascii="Arial" w:hAnsi="Arial"/>
+                <w:i w:val="false"/>
+                <w:iCs w:val="false"/>
+                <w:color w:val="000000"/>
                 <w:kern w:val="2"/>
                 <w:sz w:val="24"/>
                 <w:szCs w:val="24"/>
@@ -150,28 +198,33 @@
           </w:tcPr>
           <w:p>
             <w:pPr>
-              <w:pStyle w:val="Normal"/>
+              <w:pStyle w:val="Heading1"/>
               <w:widowControl w:val="false"/>
               <w:suppressAutoHyphens w:val="true"/>
               <w:spacing w:lineRule="auto" w:line="240" w:before="0" w:after="0"/>
               <w:jc w:val="left"/>
               <w:rPr>
-                <w:rFonts w:ascii="Arial" w:hAnsi="Arial" w:eastAsia="Aptos" w:cs=""/>
-                <w:kern w:val="2"/>
-                <w:sz w:val="24"/>
-                <w:szCs w:val="24"/>
-                <w:lang w:val="es-ES" w:eastAsia="en-US" w:bidi="ar-SA"/>
-              </w:rPr>
-            </w:pPr>
-            <w:r>
-              <w:rPr>
-                <w:rFonts w:eastAsia="Aptos" w:cs="" w:ascii="Arial" w:hAnsi="Arial"/>
-                <w:kern w:val="2"/>
-                <w:sz w:val="24"/>
-                <w:szCs w:val="24"/>
-                <w:lang w:val="es-ES" w:eastAsia="en-US" w:bidi="ar-SA"/>
-              </w:rPr>
-              <w:t>SF-002-TEST-Añadir área de triangulo</w:t>
+                <w:rFonts w:ascii="Arial" w:hAnsi="Arial"/>
+                <w:i w:val="false"/>
+                <w:i w:val="false"/>
+                <w:iCs w:val="false"/>
+                <w:color w:val="000000"/>
+                <w:sz w:val="24"/>
+                <w:szCs w:val="24"/>
+              </w:rPr>
+            </w:pPr>
+            <w:r>
+              <w:rPr>
+                <w:rFonts w:eastAsia="Aptos" w:cs="" w:ascii="Arial" w:hAnsi="Arial"/>
+                <w:i w:val="false"/>
+                <w:iCs w:val="false"/>
+                <w:color w:val="000000"/>
+                <w:kern w:val="2"/>
+                <w:sz w:val="24"/>
+                <w:szCs w:val="24"/>
+                <w:lang w:val="es-ES" w:eastAsia="en-US" w:bidi="ar-SA"/>
+              </w:rPr>
+              <w:t>SF-030-DEV – Añadir kilómetros a metros</w:t>
             </w:r>
           </w:p>
         </w:tc>
@@ -191,16 +244,21 @@
               <w:spacing w:lineRule="auto" w:line="240" w:before="0" w:after="0"/>
               <w:jc w:val="left"/>
               <w:rPr>
-                <w:rFonts w:ascii="Arial" w:hAnsi="Arial" w:eastAsia="Aptos" w:cs=""/>
-                <w:kern w:val="2"/>
-                <w:sz w:val="24"/>
-                <w:szCs w:val="24"/>
-                <w:lang w:val="es-ES" w:eastAsia="en-US" w:bidi="ar-SA"/>
-              </w:rPr>
-            </w:pPr>
-            <w:r>
-              <w:rPr>
-                <w:rFonts w:eastAsia="Aptos" w:cs="" w:ascii="Arial" w:hAnsi="Arial"/>
+                <w:rFonts w:ascii="Arial" w:hAnsi="Arial"/>
+                <w:i w:val="false"/>
+                <w:i w:val="false"/>
+                <w:iCs w:val="false"/>
+                <w:color w:val="000000"/>
+                <w:sz w:val="24"/>
+                <w:szCs w:val="24"/>
+              </w:rPr>
+            </w:pPr>
+            <w:r>
+              <w:rPr>
+                <w:rFonts w:eastAsia="Aptos" w:cs="" w:ascii="Arial" w:hAnsi="Arial"/>
+                <w:i w:val="false"/>
+                <w:iCs w:val="false"/>
+                <w:color w:val="000000"/>
                 <w:kern w:val="2"/>
                 <w:sz w:val="24"/>
                 <w:szCs w:val="24"/>
@@ -223,16 +281,21 @@
               <w:spacing w:lineRule="auto" w:line="240" w:before="0" w:after="0"/>
               <w:jc w:val="left"/>
               <w:rPr>
-                <w:rFonts w:ascii="Arial" w:hAnsi="Arial" w:eastAsia="Aptos" w:cs=""/>
-                <w:kern w:val="2"/>
-                <w:sz w:val="24"/>
-                <w:szCs w:val="24"/>
-                <w:lang w:val="es-ES" w:eastAsia="en-US" w:bidi="ar-SA"/>
-              </w:rPr>
-            </w:pPr>
-            <w:r>
-              <w:rPr>
-                <w:rFonts w:eastAsia="Aptos" w:cs="" w:ascii="Arial" w:hAnsi="Arial"/>
+                <w:rFonts w:ascii="Arial" w:hAnsi="Arial"/>
+                <w:i w:val="false"/>
+                <w:i w:val="false"/>
+                <w:iCs w:val="false"/>
+                <w:color w:val="000000"/>
+                <w:sz w:val="24"/>
+                <w:szCs w:val="24"/>
+              </w:rPr>
+            </w:pPr>
+            <w:r>
+              <w:rPr>
+                <w:rFonts w:eastAsia="Aptos" w:cs="" w:ascii="Arial" w:hAnsi="Arial"/>
+                <w:i w:val="false"/>
+                <w:iCs w:val="false"/>
+                <w:color w:val="000000"/>
                 <w:kern w:val="2"/>
                 <w:sz w:val="24"/>
                 <w:szCs w:val="24"/>
@@ -258,16 +321,21 @@
               <w:spacing w:lineRule="auto" w:line="240" w:before="0" w:after="0"/>
               <w:jc w:val="left"/>
               <w:rPr>
-                <w:rFonts w:ascii="Arial" w:hAnsi="Arial" w:eastAsia="Aptos" w:cs=""/>
-                <w:kern w:val="2"/>
-                <w:sz w:val="24"/>
-                <w:szCs w:val="24"/>
-                <w:lang w:val="es-ES" w:eastAsia="en-US" w:bidi="ar-SA"/>
-              </w:rPr>
-            </w:pPr>
-            <w:r>
-              <w:rPr>
-                <w:rFonts w:eastAsia="Aptos" w:cs="" w:ascii="Arial" w:hAnsi="Arial"/>
+                <w:rFonts w:ascii="Arial" w:hAnsi="Arial"/>
+                <w:i w:val="false"/>
+                <w:i w:val="false"/>
+                <w:iCs w:val="false"/>
+                <w:color w:val="000000"/>
+                <w:sz w:val="24"/>
+                <w:szCs w:val="24"/>
+              </w:rPr>
+            </w:pPr>
+            <w:r>
+              <w:rPr>
+                <w:rFonts w:eastAsia="Aptos" w:cs="" w:ascii="Arial" w:hAnsi="Arial"/>
+                <w:i w:val="false"/>
+                <w:iCs w:val="false"/>
+                <w:color w:val="000000"/>
                 <w:kern w:val="2"/>
                 <w:sz w:val="24"/>
                 <w:szCs w:val="24"/>
@@ -291,15 +359,22 @@
               <w:jc w:val="left"/>
               <w:rPr>
                 <w:rFonts w:ascii="Arial" w:hAnsi="Arial" w:eastAsia="Aptos" w:cs=""/>
-                <w:kern w:val="2"/>
-                <w:sz w:val="24"/>
-                <w:szCs w:val="24"/>
-                <w:lang w:val="es-ES" w:eastAsia="en-US" w:bidi="ar-SA"/>
-              </w:rPr>
-            </w:pPr>
-            <w:r>
-              <w:rPr>
-                <w:rFonts w:eastAsia="Aptos" w:cs="" w:ascii="Arial" w:hAnsi="Arial"/>
+                <w:i w:val="false"/>
+                <w:i w:val="false"/>
+                <w:iCs w:val="false"/>
+                <w:color w:val="000000"/>
+                <w:kern w:val="2"/>
+                <w:sz w:val="24"/>
+                <w:szCs w:val="24"/>
+                <w:lang w:val="es-ES" w:eastAsia="en-US" w:bidi="ar-SA"/>
+              </w:rPr>
+            </w:pPr>
+            <w:r>
+              <w:rPr>
+                <w:rFonts w:eastAsia="Aptos" w:cs="" w:ascii="Arial" w:hAnsi="Arial"/>
+                <w:i w:val="false"/>
+                <w:iCs w:val="false"/>
+                <w:color w:val="000000"/>
                 <w:kern w:val="2"/>
                 <w:sz w:val="24"/>
                 <w:szCs w:val="24"/>
@@ -316,6 +391,10 @@
         <w:spacing w:before="0" w:after="0"/>
         <w:rPr>
           <w:rFonts w:ascii="Arial" w:hAnsi="Arial"/>
+          <w:i w:val="false"/>
+          <w:i w:val="false"/>
+          <w:iCs w:val="false"/>
+          <w:color w:val="000000"/>
           <w:sz w:val="24"/>
           <w:szCs w:val="24"/>
         </w:rPr>
@@ -323,6 +402,9 @@
       <w:r>
         <w:rPr>
           <w:rFonts w:ascii="Arial" w:hAnsi="Arial"/>
+          <w:i w:val="false"/>
+          <w:iCs w:val="false"/>
+          <w:color w:val="000000"/>
           <w:sz w:val="24"/>
           <w:szCs w:val="24"/>
         </w:rPr>
@@ -333,6 +415,10 @@
         <w:pStyle w:val="Normal"/>
         <w:rPr>
           <w:rFonts w:ascii="Arial" w:hAnsi="Arial"/>
+          <w:i w:val="false"/>
+          <w:i w:val="false"/>
+          <w:iCs w:val="false"/>
+          <w:color w:val="000000"/>
           <w:sz w:val="24"/>
           <w:szCs w:val="24"/>
         </w:rPr>
@@ -340,6 +426,9 @@
       <w:r>
         <w:rPr>
           <w:rFonts w:ascii="Arial" w:hAnsi="Arial"/>
+          <w:i w:val="false"/>
+          <w:iCs w:val="false"/>
+          <w:color w:val="000000"/>
           <w:sz w:val="24"/>
           <w:szCs w:val="24"/>
         </w:rPr>
@@ -348,172 +437,97 @@
     </w:p>
     <w:p>
       <w:pPr>
-        <w:pStyle w:val="Normal"/>
+        <w:pStyle w:val="Textopreformateado"/>
         <w:spacing w:before="0" w:after="0"/>
+        <w:rPr/>
+      </w:pPr>
+      <w:r>
         <w:rPr>
+          <w:rStyle w:val="Textooriginal"/>
           <w:rFonts w:ascii="Arial" w:hAnsi="Arial"/>
+          <w:b w:val="false"/>
+          <w:bCs w:val="false"/>
+          <w:i w:val="false"/>
+          <w:iCs w:val="false"/>
+          <w:color w:val="000000"/>
+          <w:sz w:val="24"/>
+          <w:szCs w:val="24"/>
+        </w:rPr>
+        <w:t>Se añadió el método kmAMetros(double km) en la clase Conversiones y la opción 11</w:t>
+      </w:r>
+    </w:p>
+    <w:p>
+      <w:pPr>
+        <w:pStyle w:val="Textopreformateado"/>
+        <w:ind w:hanging="0" w:left="0" w:right="0"/>
+        <w:rPr/>
+      </w:pPr>
+      <w:r>
+        <w:rPr>
+          <w:rStyle w:val="Textooriginal"/>
+          <w:rFonts w:ascii="Arial" w:hAnsi="Arial"/>
+          <w:i w:val="false"/>
+          <w:iCs w:val="false"/>
+          <w:color w:val="000000"/>
+          <w:sz w:val="24"/>
+          <w:szCs w:val="24"/>
+        </w:rPr>
+        <w:t xml:space="preserve">en el MenuUtilidades.java que permite al usuario convertir kilómetros a metros </w:t>
+      </w:r>
+    </w:p>
+    <w:p>
+      <w:pPr>
+        <w:pStyle w:val="Textopreformateado"/>
+        <w:spacing w:before="0" w:after="283"/>
+        <w:ind w:hanging="0" w:left="0" w:right="0"/>
+        <w:rPr/>
+      </w:pPr>
+      <w:r>
+        <w:rPr>
+          <w:rStyle w:val="Textooriginal"/>
+          <w:rFonts w:ascii="Arial" w:hAnsi="Arial"/>
+          <w:i w:val="false"/>
+          <w:iCs w:val="false"/>
+          <w:color w:val="000000"/>
+          <w:sz w:val="24"/>
+          <w:szCs w:val="24"/>
+        </w:rPr>
+        <w:t>(1 km = 1000 metros).</w:t>
+      </w:r>
+    </w:p>
+    <w:p>
+      <w:pPr>
+        <w:pStyle w:val="Textopreformateado"/>
+        <w:spacing w:before="0" w:after="283"/>
+        <w:ind w:hanging="0" w:left="0" w:right="0"/>
+        <w:rPr>
+          <w:rStyle w:val="Textooriginal"/>
+          <w:rFonts w:ascii="Arial" w:hAnsi="Arial"/>
+          <w:i w:val="false"/>
+          <w:i w:val="false"/>
+          <w:iCs w:val="false"/>
+          <w:color w:val="000000"/>
           <w:sz w:val="24"/>
           <w:szCs w:val="24"/>
         </w:rPr>
       </w:pPr>
       <w:r>
-        <w:rPr>
-          <w:rFonts w:ascii="Arial" w:hAnsi="Arial"/>
-          <w:i/>
-          <w:iCs/>
-          <w:sz w:val="24"/>
-          <w:szCs w:val="24"/>
-        </w:rPr>
-        <w:t>La funcionalidad añade el cálculo del área de un triángulo mediante el método:</w:t>
-      </w:r>
-    </w:p>
-    <w:p>
-      <w:pPr>
-        <w:pStyle w:val="Normal"/>
-        <w:spacing w:before="0" w:after="0"/>
-        <w:rPr>
-          <w:rFonts w:ascii="Arial" w:hAnsi="Arial"/>
-          <w:sz w:val="24"/>
-          <w:szCs w:val="24"/>
-        </w:rPr>
-      </w:pPr>
-      <w:r>
-        <w:rPr>
-          <w:rFonts w:ascii="Arial" w:hAnsi="Arial"/>
-          <w:sz w:val="24"/>
-          <w:szCs w:val="24"/>
-        </w:rPr>
+        <w:rPr/>
       </w:r>
     </w:p>
     <w:p>
       <w:pPr>
         <w:pStyle w:val="Normal"/>
         <w:rPr>
-          <w:rFonts w:ascii="Arial" w:hAnsi="Arial"/>
-          <w:sz w:val="24"/>
-          <w:szCs w:val="24"/>
+          <w:u w:val="single"/>
         </w:rPr>
       </w:pPr>
       <w:r>
         <w:rPr>
           <w:rFonts w:ascii="Arial" w:hAnsi="Arial"/>
-          <w:i/>
-          <w:iCs/>
-          <w:sz w:val="24"/>
-          <w:szCs w:val="24"/>
-        </w:rPr>
-        <w:t xml:space="preserve">area = base * altura / 2 </w:t>
-      </w:r>
-    </w:p>
-    <w:p>
-      <w:pPr>
-        <w:pStyle w:val="Cuerpodetexto"/>
-        <w:jc w:val="both"/>
-        <w:rPr/>
-      </w:pPr>
-      <w:r>
-        <w:rPr>
-          <w:rFonts w:ascii="Arial" w:hAnsi="Arial"/>
-          <w:b w:val="false"/>
-          <w:bCs w:val="false"/>
-          <w:sz w:val="24"/>
-          <w:szCs w:val="24"/>
-        </w:rPr>
-        <w:t xml:space="preserve">El método </w:t>
-      </w:r>
-      <w:r>
-        <w:rPr>
-          <w:rStyle w:val="Textooriginal"/>
-          <w:rFonts w:ascii="Arial" w:hAnsi="Arial"/>
-          <w:b w:val="false"/>
-          <w:bCs w:val="false"/>
-          <w:sz w:val="24"/>
-          <w:szCs w:val="24"/>
-        </w:rPr>
-        <w:t>areaTriangulo(double base, double altura)</w:t>
-      </w:r>
-      <w:r>
-        <w:rPr>
-          <w:rFonts w:ascii="Arial" w:hAnsi="Arial"/>
-          <w:b w:val="false"/>
-          <w:bCs w:val="false"/>
-          <w:sz w:val="24"/>
-          <w:szCs w:val="24"/>
-        </w:rPr>
-        <w:t xml:space="preserve"> devuelve el área cuando los valores son válidos y devuelve </w:t>
-      </w:r>
-      <w:r>
-        <w:rPr>
-          <w:rStyle w:val="Strong"/>
-          <w:rFonts w:ascii="Arial" w:hAnsi="Arial"/>
-          <w:b w:val="false"/>
-          <w:bCs w:val="false"/>
-          <w:sz w:val="24"/>
-          <w:szCs w:val="24"/>
-        </w:rPr>
-        <w:t>-1</w:t>
-      </w:r>
-      <w:r>
-        <w:rPr>
-          <w:rFonts w:ascii="Arial" w:hAnsi="Arial"/>
-          <w:b w:val="false"/>
-          <w:bCs w:val="false"/>
-          <w:sz w:val="24"/>
-          <w:szCs w:val="24"/>
-        </w:rPr>
-        <w:t xml:space="preserve"> si la base o la altura son negativas, siguiendo la misma lógica de validación que el resto de métodos de la clase </w:t>
-      </w:r>
-      <w:r>
-        <w:rPr>
-          <w:rStyle w:val="Textooriginal"/>
-          <w:rFonts w:ascii="Arial" w:hAnsi="Arial"/>
-          <w:b w:val="false"/>
-          <w:bCs w:val="false"/>
-          <w:sz w:val="24"/>
-          <w:szCs w:val="24"/>
-        </w:rPr>
-        <w:t>Geometria</w:t>
-      </w:r>
-      <w:r>
-        <w:rPr>
-          <w:rFonts w:ascii="Arial" w:hAnsi="Arial"/>
-          <w:b w:val="false"/>
-          <w:bCs w:val="false"/>
-          <w:sz w:val="24"/>
-          <w:szCs w:val="24"/>
-        </w:rPr>
-        <w:t>.</w:t>
-      </w:r>
-    </w:p>
-    <w:p>
-      <w:pPr>
-        <w:pStyle w:val="Cuerpodetexto"/>
-        <w:rPr>
-          <w:rFonts w:ascii="Arial" w:hAnsi="Arial"/>
-          <w:sz w:val="24"/>
-          <w:szCs w:val="24"/>
-        </w:rPr>
-      </w:pPr>
-      <w:r>
-        <w:rPr>
-          <w:rFonts w:ascii="Arial" w:hAnsi="Arial"/>
-          <w:sz w:val="24"/>
-          <w:szCs w:val="24"/>
-        </w:rPr>
-      </w:r>
-    </w:p>
-    <w:p>
-      <w:pPr>
-        <w:pStyle w:val="Normal"/>
-        <w:rPr>
-          <w:rFonts w:ascii="Arial" w:hAnsi="Arial"/>
-          <w:sz w:val="24"/>
-          <w:szCs w:val="24"/>
-        </w:rPr>
-      </w:pPr>
-      <w:r>
-        <w:rPr>
-          <w:rFonts w:ascii="Arial" w:hAnsi="Arial"/>
+          <w:i w:val="false"/>
+          <w:iCs w:val="false"/>
+          <w:color w:val="000000"/>
           <w:sz w:val="24"/>
           <w:szCs w:val="24"/>
         </w:rPr>
@@ -533,20 +547,20 @@
           <w:bottom w:w="0" w:type="dxa"/>
           <w:right w:w="108" w:type="dxa"/>
         </w:tblCellMar>
-        <w:tblLook w:val="04a0" w:noHBand="0" w:noVBand="1" w:firstColumn="1" w:lastRow="0" w:lastColumn="0" w:firstRow="1"/>
+        <w:tblLook w:firstRow="1" w:noVBand="1" w:lastRow="0" w:firstColumn="1" w:lastColumn="0" w:noHBand="0" w:val="04a0"/>
       </w:tblPr>
       <w:tblGrid>
-        <w:gridCol w:w="674"/>
+        <w:gridCol w:w="673"/>
         <w:gridCol w:w="3555"/>
-        <w:gridCol w:w="2626"/>
-        <w:gridCol w:w="1919"/>
-        <w:gridCol w:w="2322"/>
+        <w:gridCol w:w="2627"/>
+        <w:gridCol w:w="1918"/>
+        <w:gridCol w:w="2323"/>
       </w:tblGrid>
       <w:tr>
         <w:trPr/>
         <w:tc>
           <w:tcPr>
-            <w:tcW w:w="674" w:type="dxa"/>
+            <w:tcW w:w="673" w:type="dxa"/>
             <w:tcBorders/>
             <w:shd w:color="auto" w:fill="A5C9EB" w:themeFill="text2" w:themeFillTint="40" w:val="clear"/>
           </w:tcPr>
@@ -558,16 +572,21 @@
               <w:spacing w:lineRule="auto" w:line="240" w:before="0" w:after="0"/>
               <w:jc w:val="center"/>
               <w:rPr>
-                <w:rFonts w:ascii="Arial" w:hAnsi="Arial" w:eastAsia="Aptos" w:cs=""/>
-                <w:kern w:val="2"/>
-                <w:sz w:val="24"/>
-                <w:szCs w:val="24"/>
-                <w:lang w:val="es-ES" w:eastAsia="en-US" w:bidi="ar-SA"/>
-              </w:rPr>
-            </w:pPr>
-            <w:r>
-              <w:rPr>
-                <w:rFonts w:eastAsia="Aptos" w:cs="" w:ascii="Arial" w:hAnsi="Arial"/>
+                <w:rFonts w:ascii="Arial" w:hAnsi="Arial"/>
+                <w:i w:val="false"/>
+                <w:i w:val="false"/>
+                <w:iCs w:val="false"/>
+                <w:color w:val="000000"/>
+                <w:sz w:val="24"/>
+                <w:szCs w:val="24"/>
+              </w:rPr>
+            </w:pPr>
+            <w:r>
+              <w:rPr>
+                <w:rFonts w:eastAsia="Aptos" w:cs="" w:ascii="Arial" w:hAnsi="Arial"/>
+                <w:i w:val="false"/>
+                <w:iCs w:val="false"/>
+                <w:color w:val="000000"/>
                 <w:kern w:val="2"/>
                 <w:sz w:val="24"/>
                 <w:szCs w:val="24"/>
@@ -591,16 +610,21 @@
               <w:spacing w:lineRule="auto" w:line="240" w:before="0" w:after="0"/>
               <w:jc w:val="center"/>
               <w:rPr>
-                <w:rFonts w:ascii="Arial" w:hAnsi="Arial" w:eastAsia="Aptos" w:cs=""/>
-                <w:kern w:val="2"/>
-                <w:sz w:val="24"/>
-                <w:szCs w:val="24"/>
-                <w:lang w:val="es-ES" w:eastAsia="en-US" w:bidi="ar-SA"/>
-              </w:rPr>
-            </w:pPr>
-            <w:r>
-              <w:rPr>
-                <w:rFonts w:eastAsia="Aptos" w:cs="" w:ascii="Arial" w:hAnsi="Arial"/>
+                <w:rFonts w:ascii="Arial" w:hAnsi="Arial"/>
+                <w:i w:val="false"/>
+                <w:i w:val="false"/>
+                <w:iCs w:val="false"/>
+                <w:color w:val="000000"/>
+                <w:sz w:val="24"/>
+                <w:szCs w:val="24"/>
+              </w:rPr>
+            </w:pPr>
+            <w:r>
+              <w:rPr>
+                <w:rFonts w:eastAsia="Aptos" w:cs="" w:ascii="Arial" w:hAnsi="Arial"/>
+                <w:i w:val="false"/>
+                <w:iCs w:val="false"/>
+                <w:color w:val="000000"/>
                 <w:kern w:val="2"/>
                 <w:sz w:val="24"/>
                 <w:szCs w:val="24"/>
@@ -612,7 +636,7 @@
         </w:tc>
         <w:tc>
           <w:tcPr>
-            <w:tcW w:w="2626" w:type="dxa"/>
+            <w:tcW w:w="2627" w:type="dxa"/>
             <w:tcBorders/>
             <w:shd w:color="auto" w:fill="A5C9EB" w:themeFill="text2" w:themeFillTint="40" w:val="clear"/>
           </w:tcPr>
@@ -624,16 +648,21 @@
               <w:spacing w:lineRule="auto" w:line="240" w:before="0" w:after="0"/>
               <w:jc w:val="center"/>
               <w:rPr>
-                <w:rFonts w:ascii="Arial" w:hAnsi="Arial" w:eastAsia="Aptos" w:cs=""/>
-                <w:kern w:val="2"/>
-                <w:sz w:val="24"/>
-                <w:szCs w:val="24"/>
-                <w:lang w:val="es-ES" w:eastAsia="en-US" w:bidi="ar-SA"/>
-              </w:rPr>
-            </w:pPr>
-            <w:r>
-              <w:rPr>
-                <w:rFonts w:eastAsia="Aptos" w:cs="" w:ascii="Arial" w:hAnsi="Arial"/>
+                <w:rFonts w:ascii="Arial" w:hAnsi="Arial"/>
+                <w:i w:val="false"/>
+                <w:i w:val="false"/>
+                <w:iCs w:val="false"/>
+                <w:color w:val="000000"/>
+                <w:sz w:val="24"/>
+                <w:szCs w:val="24"/>
+              </w:rPr>
+            </w:pPr>
+            <w:r>
+              <w:rPr>
+                <w:rFonts w:eastAsia="Aptos" w:cs="" w:ascii="Arial" w:hAnsi="Arial"/>
+                <w:i w:val="false"/>
+                <w:iCs w:val="false"/>
+                <w:color w:val="000000"/>
                 <w:kern w:val="2"/>
                 <w:sz w:val="24"/>
                 <w:szCs w:val="24"/>
@@ -645,7 +674,7 @@
         </w:tc>
         <w:tc>
           <w:tcPr>
-            <w:tcW w:w="1919" w:type="dxa"/>
+            <w:tcW w:w="1918" w:type="dxa"/>
             <w:tcBorders/>
             <w:shd w:color="auto" w:fill="A5C9EB" w:themeFill="text2" w:themeFillTint="40" w:val="clear"/>
           </w:tcPr>
@@ -657,16 +686,21 @@
               <w:spacing w:lineRule="auto" w:line="240" w:before="0" w:after="0"/>
               <w:jc w:val="center"/>
               <w:rPr>
-                <w:rFonts w:ascii="Arial" w:hAnsi="Arial" w:eastAsia="Aptos" w:cs=""/>
-                <w:kern w:val="2"/>
-                <w:sz w:val="24"/>
-                <w:szCs w:val="24"/>
-                <w:lang w:val="es-ES" w:eastAsia="en-US" w:bidi="ar-SA"/>
-              </w:rPr>
-            </w:pPr>
-            <w:r>
-              <w:rPr>
-                <w:rFonts w:eastAsia="Aptos" w:cs="" w:ascii="Arial" w:hAnsi="Arial"/>
+                <w:rFonts w:ascii="Arial" w:hAnsi="Arial"/>
+                <w:i w:val="false"/>
+                <w:i w:val="false"/>
+                <w:iCs w:val="false"/>
+                <w:color w:val="000000"/>
+                <w:sz w:val="24"/>
+                <w:szCs w:val="24"/>
+              </w:rPr>
+            </w:pPr>
+            <w:r>
+              <w:rPr>
+                <w:rFonts w:eastAsia="Aptos" w:cs="" w:ascii="Arial" w:hAnsi="Arial"/>
+                <w:i w:val="false"/>
+                <w:iCs w:val="false"/>
+                <w:color w:val="000000"/>
                 <w:kern w:val="2"/>
                 <w:sz w:val="24"/>
                 <w:szCs w:val="24"/>
@@ -678,7 +712,7 @@
         </w:tc>
         <w:tc>
           <w:tcPr>
-            <w:tcW w:w="2322" w:type="dxa"/>
+            <w:tcW w:w="2323" w:type="dxa"/>
             <w:tcBorders/>
             <w:shd w:color="auto" w:fill="A5C9EB" w:themeFill="text2" w:themeFillTint="40" w:val="clear"/>
           </w:tcPr>
@@ -690,16 +724,21 @@
               <w:spacing w:lineRule="auto" w:line="240" w:before="0" w:after="0"/>
               <w:jc w:val="center"/>
               <w:rPr>
-                <w:rFonts w:ascii="Arial" w:hAnsi="Arial" w:eastAsia="Aptos" w:cs=""/>
-                <w:kern w:val="2"/>
-                <w:sz w:val="24"/>
-                <w:szCs w:val="24"/>
-                <w:lang w:val="es-ES" w:eastAsia="en-US" w:bidi="ar-SA"/>
-              </w:rPr>
-            </w:pPr>
-            <w:r>
-              <w:rPr>
-                <w:rFonts w:eastAsia="Aptos" w:cs="" w:ascii="Arial" w:hAnsi="Arial"/>
+                <w:rFonts w:ascii="Arial" w:hAnsi="Arial"/>
+                <w:i w:val="false"/>
+                <w:i w:val="false"/>
+                <w:iCs w:val="false"/>
+                <w:color w:val="000000"/>
+                <w:sz w:val="24"/>
+                <w:szCs w:val="24"/>
+              </w:rPr>
+            </w:pPr>
+            <w:r>
+              <w:rPr>
+                <w:rFonts w:eastAsia="Aptos" w:cs="" w:ascii="Arial" w:hAnsi="Arial"/>
+                <w:i w:val="false"/>
+                <w:iCs w:val="false"/>
+                <w:color w:val="000000"/>
                 <w:kern w:val="2"/>
                 <w:sz w:val="24"/>
                 <w:szCs w:val="24"/>
@@ -714,7 +753,7 @@
         <w:trPr/>
         <w:tc>
           <w:tcPr>
-            <w:tcW w:w="674" w:type="dxa"/>
+            <w:tcW w:w="673" w:type="dxa"/>
             <w:tcBorders/>
           </w:tcPr>
           <w:p>
@@ -725,16 +764,21 @@
               <w:spacing w:lineRule="auto" w:line="240" w:before="0" w:after="0"/>
               <w:jc w:val="center"/>
               <w:rPr>
-                <w:rFonts w:ascii="Arial" w:hAnsi="Arial" w:eastAsia="Aptos" w:cs=""/>
-                <w:kern w:val="2"/>
-                <w:sz w:val="24"/>
-                <w:szCs w:val="24"/>
-                <w:lang w:val="es-ES" w:eastAsia="en-US" w:bidi="ar-SA"/>
-              </w:rPr>
-            </w:pPr>
-            <w:r>
-              <w:rPr>
-                <w:rFonts w:eastAsia="Aptos" w:cs="" w:ascii="Arial" w:hAnsi="Arial"/>
+                <w:rFonts w:ascii="Arial" w:hAnsi="Arial"/>
+                <w:i w:val="false"/>
+                <w:i w:val="false"/>
+                <w:iCs w:val="false"/>
+                <w:color w:val="000000"/>
+                <w:sz w:val="24"/>
+                <w:szCs w:val="24"/>
+              </w:rPr>
+            </w:pPr>
+            <w:r>
+              <w:rPr>
+                <w:rFonts w:eastAsia="Aptos" w:cs="" w:ascii="Arial" w:hAnsi="Arial"/>
+                <w:i w:val="false"/>
+                <w:iCs w:val="false"/>
+                <w:color w:val="000000"/>
                 <w:kern w:val="2"/>
                 <w:sz w:val="24"/>
                 <w:szCs w:val="24"/>
@@ -757,112 +801,169 @@
               <w:spacing w:lineRule="auto" w:line="240" w:before="0" w:after="0"/>
               <w:jc w:val="center"/>
               <w:rPr>
+                <w:rFonts w:ascii="Arial" w:hAnsi="Arial"/>
+                <w:i w:val="false"/>
+                <w:i w:val="false"/>
+                <w:iCs w:val="false"/>
+                <w:color w:val="000000"/>
+                <w:sz w:val="24"/>
+                <w:szCs w:val="24"/>
+              </w:rPr>
+            </w:pPr>
+            <w:r>
+              <w:rPr>
+                <w:rFonts w:eastAsia="Aptos" w:cs="" w:ascii="Arial" w:hAnsi="Arial"/>
+                <w:i w:val="false"/>
+                <w:iCs w:val="false"/>
+                <w:color w:val="000000"/>
+                <w:kern w:val="2"/>
+                <w:sz w:val="24"/>
+                <w:szCs w:val="24"/>
+                <w:lang w:val="es-ES" w:eastAsia="en-US" w:bidi="ar-SA"/>
+              </w:rPr>
+              <w:t>Caso base</w:t>
+            </w:r>
+          </w:p>
+        </w:tc>
+        <w:tc>
+          <w:tcPr>
+            <w:tcW w:w="2627" w:type="dxa"/>
+            <w:vMerge w:val="restart"/>
+            <w:tcBorders/>
+            <w:vAlign w:val="center"/>
+          </w:tcPr>
+          <w:p>
+            <w:pPr>
+              <w:pStyle w:val="Normal"/>
+              <w:widowControl w:val="false"/>
+              <w:suppressAutoHyphens w:val="true"/>
+              <w:spacing w:lineRule="auto" w:line="240" w:before="0" w:after="0"/>
+              <w:jc w:val="center"/>
+              <w:rPr>
+                <w:rFonts w:ascii="Arial" w:hAnsi="Arial"/>
+                <w:i w:val="false"/>
+                <w:i w:val="false"/>
+                <w:iCs w:val="false"/>
+                <w:color w:val="000000"/>
+                <w:sz w:val="24"/>
+                <w:szCs w:val="24"/>
+              </w:rPr>
+            </w:pPr>
+            <w:r>
+              <w:rPr>
+                <w:rFonts w:eastAsia="Aptos" w:cs="" w:ascii="Arial" w:hAnsi="Arial"/>
+                <w:i w:val="false"/>
+                <w:iCs w:val="false"/>
+                <w:color w:val="000000"/>
+                <w:kern w:val="2"/>
+                <w:sz w:val="24"/>
+                <w:szCs w:val="24"/>
+                <w:lang w:val="es-ES" w:eastAsia="en-US" w:bidi="ar-SA"/>
+              </w:rPr>
+              <w:t>MenuUtilidades</w:t>
+            </w:r>
+          </w:p>
+          <w:p>
+            <w:pPr>
+              <w:pStyle w:val="Normal"/>
+              <w:widowControl w:val="false"/>
+              <w:suppressAutoHyphens w:val="true"/>
+              <w:spacing w:lineRule="auto" w:line="240" w:before="0" w:after="0"/>
+              <w:jc w:val="center"/>
+              <w:rPr>
+                <w:rFonts w:ascii="Arial" w:hAnsi="Arial"/>
+                <w:i w:val="false"/>
+                <w:i w:val="false"/>
+                <w:iCs w:val="false"/>
+                <w:color w:val="000000"/>
+                <w:sz w:val="24"/>
+                <w:szCs w:val="24"/>
+              </w:rPr>
+            </w:pPr>
+            <w:r>
+              <w:rPr>
+                <w:rFonts w:eastAsia="Aptos" w:cs="" w:ascii="Arial" w:hAnsi="Arial"/>
+                <w:i w:val="false"/>
+                <w:iCs w:val="false"/>
+                <w:color w:val="000000"/>
+                <w:kern w:val="2"/>
+                <w:sz w:val="24"/>
+                <w:szCs w:val="24"/>
+                <w:lang w:val="es-ES" w:eastAsia="en-US" w:bidi="ar-SA"/>
+              </w:rPr>
+              <w:t>/</w:t>
+              <w:br/>
+              <w:t>Converiones</w:t>
+            </w:r>
+          </w:p>
+        </w:tc>
+        <w:tc>
+          <w:tcPr>
+            <w:tcW w:w="1918" w:type="dxa"/>
+            <w:tcBorders/>
+          </w:tcPr>
+          <w:p>
+            <w:pPr>
+              <w:pStyle w:val="Normal"/>
+              <w:widowControl w:val="false"/>
+              <w:suppressAutoHyphens w:val="true"/>
+              <w:spacing w:lineRule="auto" w:line="240" w:before="0" w:after="0"/>
+              <w:jc w:val="center"/>
+              <w:rPr>
+                <w:rFonts w:ascii="Arial" w:hAnsi="Arial"/>
+                <w:i w:val="false"/>
+                <w:i w:val="false"/>
+                <w:iCs w:val="false"/>
+                <w:color w:val="000000"/>
+                <w:sz w:val="24"/>
+                <w:szCs w:val="24"/>
+              </w:rPr>
+            </w:pPr>
+            <w:r>
+              <w:rPr>
+                <w:rFonts w:eastAsia="Aptos" w:cs="" w:ascii="Arial" w:hAnsi="Arial"/>
+                <w:i w:val="false"/>
+                <w:iCs w:val="false"/>
+                <w:color w:val="000000"/>
+                <w:kern w:val="2"/>
+                <w:sz w:val="24"/>
+                <w:szCs w:val="24"/>
+                <w:lang w:val="es-ES" w:eastAsia="en-US" w:bidi="ar-SA"/>
+              </w:rPr>
+              <w:t>1.0</w:t>
+            </w:r>
+          </w:p>
+        </w:tc>
+        <w:tc>
+          <w:tcPr>
+            <w:tcW w:w="2323" w:type="dxa"/>
+            <w:tcBorders/>
+          </w:tcPr>
+          <w:p>
+            <w:pPr>
+              <w:pStyle w:val="Normal"/>
+              <w:widowControl w:val="false"/>
+              <w:suppressAutoHyphens w:val="true"/>
+              <w:spacing w:lineRule="auto" w:line="240" w:before="0" w:after="0"/>
+              <w:jc w:val="center"/>
+              <w:rPr>
                 <w:rFonts w:ascii="Arial" w:hAnsi="Arial" w:eastAsia="Aptos" w:cs=""/>
-                <w:kern w:val="2"/>
-                <w:sz w:val="24"/>
-                <w:szCs w:val="24"/>
-                <w:lang w:val="es-ES" w:eastAsia="en-US" w:bidi="ar-SA"/>
-              </w:rPr>
-            </w:pPr>
-            <w:r>
-              <w:rPr>
-                <w:rFonts w:eastAsia="Aptos" w:cs="" w:ascii="Arial" w:hAnsi="Arial"/>
-                <w:kern w:val="2"/>
-                <w:sz w:val="24"/>
-                <w:szCs w:val="24"/>
-                <w:lang w:val="es-ES" w:eastAsia="en-US" w:bidi="ar-SA"/>
-              </w:rPr>
-              <w:t>Introducir base=4, altura=6 desde menú Geometría</w:t>
-            </w:r>
-          </w:p>
-        </w:tc>
-        <w:tc>
-          <w:tcPr>
-            <w:tcW w:w="2626" w:type="dxa"/>
-            <w:tcBorders/>
-          </w:tcPr>
-          <w:p>
-            <w:pPr>
-              <w:pStyle w:val="Normal"/>
-              <w:widowControl w:val="false"/>
-              <w:suppressAutoHyphens w:val="true"/>
-              <w:spacing w:lineRule="auto" w:line="240" w:before="0" w:after="0"/>
-              <w:jc w:val="center"/>
-              <w:rPr>
-                <w:rFonts w:ascii="Arial" w:hAnsi="Arial" w:eastAsia="Aptos" w:cs=""/>
-                <w:kern w:val="2"/>
-                <w:sz w:val="24"/>
-                <w:szCs w:val="24"/>
-                <w:lang w:val="es-ES" w:eastAsia="en-US" w:bidi="ar-SA"/>
-              </w:rPr>
-            </w:pPr>
-            <w:r>
-              <w:rPr>
-                <w:rFonts w:eastAsia="Aptos" w:cs="" w:ascii="Arial" w:hAnsi="Arial"/>
-                <w:kern w:val="2"/>
-                <w:sz w:val="24"/>
-                <w:szCs w:val="24"/>
-                <w:lang w:val="es-ES" w:eastAsia="en-US" w:bidi="ar-SA"/>
-              </w:rPr>
-              <w:t>Geometria.java, MenuGeometria.java</w:t>
-            </w:r>
-          </w:p>
-        </w:tc>
-        <w:tc>
-          <w:tcPr>
-            <w:tcW w:w="1919" w:type="dxa"/>
-            <w:tcBorders/>
-          </w:tcPr>
-          <w:p>
-            <w:pPr>
-              <w:pStyle w:val="Normal"/>
-              <w:widowControl w:val="false"/>
-              <w:suppressAutoHyphens w:val="true"/>
-              <w:spacing w:lineRule="auto" w:line="240" w:before="0" w:after="0"/>
-              <w:jc w:val="center"/>
-              <w:rPr>
-                <w:rFonts w:ascii="Arial" w:hAnsi="Arial" w:eastAsia="Aptos" w:cs=""/>
-                <w:kern w:val="2"/>
-                <w:sz w:val="24"/>
-                <w:szCs w:val="24"/>
-                <w:lang w:val="es-ES" w:eastAsia="en-US" w:bidi="ar-SA"/>
-              </w:rPr>
-            </w:pPr>
-            <w:r>
-              <w:rPr>
-                <w:rFonts w:eastAsia="Aptos" w:cs="" w:ascii="Arial" w:hAnsi="Arial"/>
-                <w:kern w:val="2"/>
-                <w:sz w:val="24"/>
-                <w:szCs w:val="24"/>
-                <w:lang w:val="es-ES" w:eastAsia="en-US" w:bidi="ar-SA"/>
-              </w:rPr>
-              <w:t>12.0</w:t>
-            </w:r>
-          </w:p>
-        </w:tc>
-        <w:tc>
-          <w:tcPr>
-            <w:tcW w:w="2322" w:type="dxa"/>
-            <w:tcBorders/>
-          </w:tcPr>
-          <w:p>
-            <w:pPr>
-              <w:pStyle w:val="Normal"/>
-              <w:widowControl w:val="false"/>
-              <w:suppressAutoHyphens w:val="true"/>
-              <w:spacing w:lineRule="auto" w:line="240" w:before="0" w:after="0"/>
-              <w:jc w:val="center"/>
-              <w:rPr>
-                <w:rFonts w:ascii="Arial" w:hAnsi="Arial" w:eastAsia="Aptos" w:cs=""/>
-                <w:kern w:val="2"/>
-                <w:sz w:val="24"/>
-                <w:szCs w:val="24"/>
-                <w:lang w:val="es-ES" w:eastAsia="en-US" w:bidi="ar-SA"/>
-              </w:rPr>
-            </w:pPr>
-            <w:r>
-              <w:rPr>
-                <w:rFonts w:eastAsia="Aptos" w:cs="" w:ascii="Arial" w:hAnsi="Arial"/>
+                <w:i w:val="false"/>
+                <w:i w:val="false"/>
+                <w:iCs w:val="false"/>
+                <w:color w:val="000000"/>
+                <w:kern w:val="2"/>
+                <w:sz w:val="24"/>
+                <w:szCs w:val="24"/>
+                <w:lang w:val="es-ES" w:eastAsia="en-US" w:bidi="ar-SA"/>
+              </w:rPr>
+            </w:pPr>
+            <w:r>
+              <w:rPr>
+                <w:rFonts w:eastAsia="Aptos" w:cs="" w:ascii="Arial" w:hAnsi="Arial"/>
+                <w:i w:val="false"/>
+                <w:iCs w:val="false"/>
+                <w:color w:val="000000"/>
                 <w:kern w:val="2"/>
                 <w:sz w:val="24"/>
                 <w:szCs w:val="24"/>
@@ -876,7 +977,7 @@
         <w:trPr/>
         <w:tc>
           <w:tcPr>
-            <w:tcW w:w="674" w:type="dxa"/>
+            <w:tcW w:w="673" w:type="dxa"/>
             <w:tcBorders/>
           </w:tcPr>
           <w:p>
@@ -887,16 +988,21 @@
               <w:spacing w:lineRule="auto" w:line="240" w:before="0" w:after="0"/>
               <w:jc w:val="center"/>
               <w:rPr>
-                <w:rFonts w:ascii="Arial" w:hAnsi="Arial" w:eastAsia="Aptos" w:cs=""/>
-                <w:kern w:val="2"/>
-                <w:sz w:val="24"/>
-                <w:szCs w:val="24"/>
-                <w:lang w:val="es-ES" w:eastAsia="en-US" w:bidi="ar-SA"/>
-              </w:rPr>
-            </w:pPr>
-            <w:r>
-              <w:rPr>
-                <w:rFonts w:eastAsia="Aptos" w:cs="" w:ascii="Arial" w:hAnsi="Arial"/>
+                <w:rFonts w:ascii="Arial" w:hAnsi="Arial"/>
+                <w:i w:val="false"/>
+                <w:i w:val="false"/>
+                <w:iCs w:val="false"/>
+                <w:color w:val="000000"/>
+                <w:sz w:val="24"/>
+                <w:szCs w:val="24"/>
+              </w:rPr>
+            </w:pPr>
+            <w:r>
+              <w:rPr>
+                <w:rFonts w:eastAsia="Aptos" w:cs="" w:ascii="Arial" w:hAnsi="Arial"/>
+                <w:i w:val="false"/>
+                <w:iCs w:val="false"/>
+                <w:color w:val="000000"/>
                 <w:kern w:val="2"/>
                 <w:sz w:val="24"/>
                 <w:szCs w:val="24"/>
@@ -919,112 +1025,132 @@
               <w:spacing w:lineRule="auto" w:line="240" w:before="0" w:after="0"/>
               <w:jc w:val="center"/>
               <w:rPr>
+                <w:rFonts w:ascii="Arial" w:hAnsi="Arial"/>
+                <w:i w:val="false"/>
+                <w:i w:val="false"/>
+                <w:iCs w:val="false"/>
+                <w:color w:val="000000"/>
+                <w:sz w:val="24"/>
+                <w:szCs w:val="24"/>
+              </w:rPr>
+            </w:pPr>
+            <w:r>
+              <w:rPr>
+                <w:rFonts w:eastAsia="Aptos" w:cs="" w:ascii="Arial" w:hAnsi="Arial"/>
+                <w:i w:val="false"/>
+                <w:iCs w:val="false"/>
+                <w:color w:val="000000"/>
+                <w:kern w:val="2"/>
+                <w:sz w:val="24"/>
+                <w:szCs w:val="24"/>
+                <w:lang w:val="es-ES" w:eastAsia="en-US" w:bidi="ar-SA"/>
+              </w:rPr>
+              <w:t>Con decimales</w:t>
+            </w:r>
+          </w:p>
+        </w:tc>
+        <w:tc>
+          <w:tcPr>
+            <w:tcW w:w="2627" w:type="dxa"/>
+            <w:vMerge w:val="continue"/>
+            <w:tcBorders/>
+          </w:tcPr>
+          <w:p>
+            <w:pPr>
+              <w:pStyle w:val="Normal"/>
+              <w:widowControl w:val="false"/>
+              <w:suppressAutoHyphens w:val="true"/>
+              <w:spacing w:lineRule="auto" w:line="240" w:before="0" w:after="0"/>
+              <w:jc w:val="center"/>
+              <w:rPr>
+                <w:rFonts w:ascii="Arial" w:hAnsi="Arial"/>
+                <w:i w:val="false"/>
+                <w:i w:val="false"/>
+                <w:iCs w:val="false"/>
+                <w:color w:val="000000"/>
+                <w:sz w:val="24"/>
+                <w:szCs w:val="24"/>
+              </w:rPr>
+            </w:pPr>
+            <w:r>
+              <w:rPr>
+                <w:rFonts w:ascii="Arial" w:hAnsi="Arial"/>
+                <w:i w:val="false"/>
+                <w:iCs w:val="false"/>
+                <w:color w:val="000000"/>
+                <w:sz w:val="24"/>
+                <w:szCs w:val="24"/>
+              </w:rPr>
+            </w:r>
+          </w:p>
+        </w:tc>
+        <w:tc>
+          <w:tcPr>
+            <w:tcW w:w="1918" w:type="dxa"/>
+            <w:tcBorders/>
+          </w:tcPr>
+          <w:p>
+            <w:pPr>
+              <w:pStyle w:val="Normal"/>
+              <w:widowControl w:val="false"/>
+              <w:suppressAutoHyphens w:val="true"/>
+              <w:spacing w:lineRule="auto" w:line="240" w:before="0" w:after="0"/>
+              <w:jc w:val="center"/>
+              <w:rPr>
+                <w:rFonts w:ascii="Arial" w:hAnsi="Arial"/>
+                <w:i w:val="false"/>
+                <w:i w:val="false"/>
+                <w:iCs w:val="false"/>
+                <w:color w:val="000000"/>
+                <w:sz w:val="24"/>
+                <w:szCs w:val="24"/>
+              </w:rPr>
+            </w:pPr>
+            <w:r>
+              <w:rPr>
+                <w:rFonts w:eastAsia="Aptos" w:cs="" w:ascii="Arial" w:hAnsi="Arial"/>
+                <w:i w:val="false"/>
+                <w:iCs w:val="false"/>
+                <w:color w:val="000000"/>
+                <w:kern w:val="2"/>
+                <w:sz w:val="24"/>
+                <w:szCs w:val="24"/>
+                <w:lang w:val="es-ES" w:eastAsia="en-US" w:bidi="ar-SA"/>
+              </w:rPr>
+              <w:t>2-75</w:t>
+            </w:r>
+          </w:p>
+        </w:tc>
+        <w:tc>
+          <w:tcPr>
+            <w:tcW w:w="2323" w:type="dxa"/>
+            <w:tcBorders/>
+          </w:tcPr>
+          <w:p>
+            <w:pPr>
+              <w:pStyle w:val="Normal"/>
+              <w:widowControl w:val="false"/>
+              <w:suppressAutoHyphens w:val="true"/>
+              <w:spacing w:lineRule="auto" w:line="240" w:before="0" w:after="0"/>
+              <w:jc w:val="center"/>
+              <w:rPr>
                 <w:rFonts w:ascii="Arial" w:hAnsi="Arial" w:eastAsia="Aptos" w:cs=""/>
-                <w:kern w:val="2"/>
-                <w:sz w:val="24"/>
-                <w:szCs w:val="24"/>
-                <w:lang w:val="es-ES" w:eastAsia="en-US" w:bidi="ar-SA"/>
-              </w:rPr>
-            </w:pPr>
-            <w:r>
-              <w:rPr>
-                <w:rFonts w:eastAsia="Aptos" w:cs="" w:ascii="Arial" w:hAnsi="Arial"/>
-                <w:kern w:val="2"/>
-                <w:sz w:val="24"/>
-                <w:szCs w:val="24"/>
-                <w:lang w:val="es-ES" w:eastAsia="en-US" w:bidi="ar-SA"/>
-              </w:rPr>
-              <w:t>Introducir base=0, altura=5 desde menú Geometría</w:t>
-            </w:r>
-          </w:p>
-        </w:tc>
-        <w:tc>
-          <w:tcPr>
-            <w:tcW w:w="2626" w:type="dxa"/>
-            <w:tcBorders/>
-          </w:tcPr>
-          <w:p>
-            <w:pPr>
-              <w:pStyle w:val="Normal"/>
-              <w:widowControl w:val="false"/>
-              <w:suppressAutoHyphens w:val="true"/>
-              <w:spacing w:lineRule="auto" w:line="240" w:before="0" w:after="0"/>
-              <w:jc w:val="center"/>
-              <w:rPr>
-                <w:rFonts w:ascii="Arial" w:hAnsi="Arial" w:eastAsia="Aptos" w:cs=""/>
-                <w:kern w:val="2"/>
-                <w:sz w:val="24"/>
-                <w:szCs w:val="24"/>
-                <w:lang w:val="es-ES" w:eastAsia="en-US" w:bidi="ar-SA"/>
-              </w:rPr>
-            </w:pPr>
-            <w:r>
-              <w:rPr>
-                <w:rFonts w:eastAsia="Aptos" w:cs="" w:ascii="Arial" w:hAnsi="Arial"/>
-                <w:kern w:val="2"/>
-                <w:sz w:val="24"/>
-                <w:szCs w:val="24"/>
-                <w:lang w:val="es-ES" w:eastAsia="en-US" w:bidi="ar-SA"/>
-              </w:rPr>
-              <w:t>Geometria.java, MenuGeometria.java</w:t>
-            </w:r>
-          </w:p>
-        </w:tc>
-        <w:tc>
-          <w:tcPr>
-            <w:tcW w:w="1919" w:type="dxa"/>
-            <w:tcBorders/>
-          </w:tcPr>
-          <w:p>
-            <w:pPr>
-              <w:pStyle w:val="Normal"/>
-              <w:widowControl w:val="false"/>
-              <w:suppressAutoHyphens w:val="true"/>
-              <w:spacing w:lineRule="auto" w:line="240" w:before="0" w:after="0"/>
-              <w:jc w:val="center"/>
-              <w:rPr>
-                <w:rFonts w:ascii="Arial" w:hAnsi="Arial" w:eastAsia="Aptos" w:cs=""/>
-                <w:kern w:val="2"/>
-                <w:sz w:val="24"/>
-                <w:szCs w:val="24"/>
-                <w:lang w:val="es-ES" w:eastAsia="en-US" w:bidi="ar-SA"/>
-              </w:rPr>
-            </w:pPr>
-            <w:r>
-              <w:rPr>
-                <w:rFonts w:eastAsia="Aptos" w:cs="" w:ascii="Arial" w:hAnsi="Arial"/>
-                <w:kern w:val="2"/>
-                <w:sz w:val="24"/>
-                <w:szCs w:val="24"/>
-                <w:lang w:val="es-ES" w:eastAsia="en-US" w:bidi="ar-SA"/>
-              </w:rPr>
-              <w:t>0.0</w:t>
-            </w:r>
-          </w:p>
-        </w:tc>
-        <w:tc>
-          <w:tcPr>
-            <w:tcW w:w="2322" w:type="dxa"/>
-            <w:tcBorders/>
-          </w:tcPr>
-          <w:p>
-            <w:pPr>
-              <w:pStyle w:val="Normal"/>
-              <w:widowControl w:val="false"/>
-              <w:suppressAutoHyphens w:val="true"/>
-              <w:spacing w:lineRule="auto" w:line="240" w:before="0" w:after="0"/>
-              <w:jc w:val="center"/>
-              <w:rPr>
-                <w:rFonts w:ascii="Arial" w:hAnsi="Arial" w:eastAsia="Aptos" w:cs=""/>
-                <w:kern w:val="2"/>
-                <w:sz w:val="24"/>
-                <w:szCs w:val="24"/>
-                <w:lang w:val="es-ES" w:eastAsia="en-US" w:bidi="ar-SA"/>
-              </w:rPr>
-            </w:pPr>
-            <w:r>
-              <w:rPr>
-                <w:rFonts w:eastAsia="Aptos" w:cs="" w:ascii="Arial" w:hAnsi="Arial"/>
+                <w:i w:val="false"/>
+                <w:i w:val="false"/>
+                <w:iCs w:val="false"/>
+                <w:color w:val="000000"/>
+                <w:kern w:val="2"/>
+                <w:sz w:val="24"/>
+                <w:szCs w:val="24"/>
+                <w:lang w:val="es-ES" w:eastAsia="en-US" w:bidi="ar-SA"/>
+              </w:rPr>
+            </w:pPr>
+            <w:r>
+              <w:rPr>
+                <w:rFonts w:eastAsia="Aptos" w:cs="" w:ascii="Arial" w:hAnsi="Arial"/>
+                <w:i w:val="false"/>
+                <w:iCs w:val="false"/>
+                <w:color w:val="000000"/>
                 <w:kern w:val="2"/>
                 <w:sz w:val="24"/>
                 <w:szCs w:val="24"/>
@@ -1038,7 +1164,7 @@
         <w:trPr/>
         <w:tc>
           <w:tcPr>
-            <w:tcW w:w="674" w:type="dxa"/>
+            <w:tcW w:w="673" w:type="dxa"/>
             <w:tcBorders/>
           </w:tcPr>
           <w:p>
@@ -1049,16 +1175,21 @@
               <w:spacing w:lineRule="auto" w:line="240" w:before="0" w:after="0"/>
               <w:jc w:val="center"/>
               <w:rPr>
-                <w:rFonts w:ascii="Arial" w:hAnsi="Arial" w:eastAsia="Aptos" w:cs=""/>
-                <w:kern w:val="2"/>
-                <w:sz w:val="24"/>
-                <w:szCs w:val="24"/>
-                <w:lang w:val="es-ES" w:eastAsia="en-US" w:bidi="ar-SA"/>
-              </w:rPr>
-            </w:pPr>
-            <w:r>
-              <w:rPr>
-                <w:rFonts w:eastAsia="Aptos" w:cs="" w:ascii="Arial" w:hAnsi="Arial"/>
+                <w:rFonts w:ascii="Arial" w:hAnsi="Arial"/>
+                <w:i w:val="false"/>
+                <w:i w:val="false"/>
+                <w:iCs w:val="false"/>
+                <w:color w:val="000000"/>
+                <w:sz w:val="24"/>
+                <w:szCs w:val="24"/>
+              </w:rPr>
+            </w:pPr>
+            <w:r>
+              <w:rPr>
+                <w:rFonts w:eastAsia="Aptos" w:cs="" w:ascii="Arial" w:hAnsi="Arial"/>
+                <w:i w:val="false"/>
+                <w:iCs w:val="false"/>
+                <w:color w:val="000000"/>
                 <w:kern w:val="2"/>
                 <w:sz w:val="24"/>
                 <w:szCs w:val="24"/>
@@ -1081,28 +1212,229 @@
               <w:spacing w:lineRule="auto" w:line="240" w:before="0" w:after="0"/>
               <w:jc w:val="center"/>
               <w:rPr>
+                <w:rFonts w:ascii="Arial" w:hAnsi="Arial"/>
+                <w:i w:val="false"/>
+                <w:i w:val="false"/>
+                <w:iCs w:val="false"/>
+                <w:color w:val="000000"/>
+                <w:sz w:val="24"/>
+                <w:szCs w:val="24"/>
+              </w:rPr>
+            </w:pPr>
+            <w:r>
+              <w:rPr>
+                <w:rFonts w:eastAsia="Aptos" w:cs="" w:ascii="Arial" w:hAnsi="Arial"/>
+                <w:i w:val="false"/>
+                <w:iCs w:val="false"/>
+                <w:color w:val="000000"/>
+                <w:kern w:val="2"/>
+                <w:sz w:val="24"/>
+                <w:szCs w:val="24"/>
+                <w:lang w:val="es-ES" w:eastAsia="en-US" w:bidi="ar-SA"/>
+              </w:rPr>
+              <w:t>Valor grande</w:t>
+            </w:r>
+          </w:p>
+        </w:tc>
+        <w:tc>
+          <w:tcPr>
+            <w:tcW w:w="2627" w:type="dxa"/>
+            <w:vMerge w:val="continue"/>
+            <w:tcBorders/>
+          </w:tcPr>
+          <w:p>
+            <w:pPr>
+              <w:pStyle w:val="Normal"/>
+              <w:widowControl w:val="false"/>
+              <w:suppressAutoHyphens w:val="true"/>
+              <w:spacing w:lineRule="auto" w:line="240" w:before="0" w:after="0"/>
+              <w:jc w:val="center"/>
+              <w:rPr>
+                <w:rFonts w:ascii="Arial" w:hAnsi="Arial"/>
+                <w:i w:val="false"/>
+                <w:i w:val="false"/>
+                <w:iCs w:val="false"/>
+                <w:color w:val="000000"/>
+                <w:sz w:val="24"/>
+                <w:szCs w:val="24"/>
+              </w:rPr>
+            </w:pPr>
+            <w:r>
+              <w:rPr>
+                <w:rFonts w:ascii="Arial" w:hAnsi="Arial"/>
+                <w:i w:val="false"/>
+                <w:iCs w:val="false"/>
+                <w:color w:val="000000"/>
+                <w:sz w:val="24"/>
+                <w:szCs w:val="24"/>
+              </w:rPr>
+            </w:r>
+          </w:p>
+        </w:tc>
+        <w:tc>
+          <w:tcPr>
+            <w:tcW w:w="1918" w:type="dxa"/>
+            <w:tcBorders/>
+          </w:tcPr>
+          <w:p>
+            <w:pPr>
+              <w:pStyle w:val="Normal"/>
+              <w:widowControl w:val="false"/>
+              <w:suppressAutoHyphens w:val="true"/>
+              <w:spacing w:lineRule="auto" w:line="240" w:before="0" w:after="0"/>
+              <w:jc w:val="center"/>
+              <w:rPr>
+                <w:rFonts w:ascii="Arial" w:hAnsi="Arial"/>
+                <w:i w:val="false"/>
+                <w:i w:val="false"/>
+                <w:iCs w:val="false"/>
+                <w:color w:val="000000"/>
+                <w:sz w:val="24"/>
+                <w:szCs w:val="24"/>
+              </w:rPr>
+            </w:pPr>
+            <w:r>
+              <w:rPr>
+                <w:rFonts w:eastAsia="Aptos" w:cs="" w:ascii="Arial" w:hAnsi="Arial"/>
+                <w:i w:val="false"/>
+                <w:iCs w:val="false"/>
+                <w:color w:val="000000"/>
+                <w:kern w:val="2"/>
+                <w:sz w:val="24"/>
+                <w:szCs w:val="24"/>
+                <w:lang w:val="es-ES" w:eastAsia="en-US" w:bidi="ar-SA"/>
+              </w:rPr>
+              <w:t>15.5</w:t>
+            </w:r>
+          </w:p>
+        </w:tc>
+        <w:tc>
+          <w:tcPr>
+            <w:tcW w:w="2323" w:type="dxa"/>
+            <w:tcBorders/>
+          </w:tcPr>
+          <w:p>
+            <w:pPr>
+              <w:pStyle w:val="Normal"/>
+              <w:widowControl w:val="false"/>
+              <w:suppressAutoHyphens w:val="true"/>
+              <w:spacing w:lineRule="auto" w:line="240" w:before="0" w:after="0"/>
+              <w:jc w:val="center"/>
+              <w:rPr>
                 <w:rFonts w:ascii="Arial" w:hAnsi="Arial" w:eastAsia="Aptos" w:cs=""/>
-                <w:kern w:val="2"/>
-                <w:sz w:val="24"/>
-                <w:szCs w:val="24"/>
-                <w:lang w:val="es-ES" w:eastAsia="en-US" w:bidi="ar-SA"/>
-              </w:rPr>
-            </w:pPr>
-            <w:r>
-              <w:rPr>
-                <w:rFonts w:eastAsia="Aptos" w:cs="" w:ascii="Arial" w:hAnsi="Arial"/>
-                <w:kern w:val="2"/>
-                <w:sz w:val="24"/>
-                <w:szCs w:val="24"/>
-                <w:lang w:val="es-ES" w:eastAsia="en-US" w:bidi="ar-SA"/>
-              </w:rPr>
-              <w:t>Introducir base=-3, altura=5 desde menú Geometría</w:t>
-            </w:r>
-          </w:p>
-        </w:tc>
-        <w:tc>
-          <w:tcPr>
-            <w:tcW w:w="2626" w:type="dxa"/>
+                <w:i w:val="false"/>
+                <w:i w:val="false"/>
+                <w:iCs w:val="false"/>
+                <w:color w:val="000000"/>
+                <w:kern w:val="2"/>
+                <w:sz w:val="24"/>
+                <w:szCs w:val="24"/>
+                <w:lang w:val="es-ES" w:eastAsia="en-US" w:bidi="ar-SA"/>
+              </w:rPr>
+            </w:pPr>
+            <w:r>
+              <w:rPr>
+                <w:rFonts w:eastAsia="Aptos" w:cs="" w:ascii="Arial" w:hAnsi="Arial"/>
+                <w:i w:val="false"/>
+                <w:iCs w:val="false"/>
+                <w:color w:val="000000"/>
+                <w:kern w:val="2"/>
+                <w:sz w:val="24"/>
+                <w:szCs w:val="24"/>
+                <w:lang w:val="es-ES" w:eastAsia="en-US" w:bidi="ar-SA"/>
+              </w:rPr>
+            </w:r>
+          </w:p>
+        </w:tc>
+      </w:tr>
+      <w:tr>
+        <w:trPr/>
+        <w:tc>
+          <w:tcPr>
+            <w:tcW w:w="673" w:type="dxa"/>
+            <w:tcBorders>
+              <w:top w:val="nil"/>
+            </w:tcBorders>
+          </w:tcPr>
+          <w:p>
+            <w:pPr>
+              <w:pStyle w:val="Normal"/>
+              <w:widowControl w:val="false"/>
+              <w:suppressAutoHyphens w:val="true"/>
+              <w:spacing w:lineRule="auto" w:line="240" w:before="0" w:after="0"/>
+              <w:jc w:val="center"/>
+              <w:rPr>
+                <w:rFonts w:ascii="Arial" w:hAnsi="Arial" w:eastAsia="Aptos" w:cs=""/>
+                <w:i w:val="false"/>
+                <w:i w:val="false"/>
+                <w:iCs w:val="false"/>
+                <w:color w:val="000000"/>
+                <w:kern w:val="2"/>
+                <w:sz w:val="24"/>
+                <w:szCs w:val="24"/>
+                <w:lang w:val="es-ES" w:eastAsia="en-US" w:bidi="ar-SA"/>
+              </w:rPr>
+            </w:pPr>
+            <w:r>
+              <w:rPr>
+                <w:rFonts w:eastAsia="Aptos" w:cs="" w:ascii="Arial" w:hAnsi="Arial"/>
+                <w:i w:val="false"/>
+                <w:iCs w:val="false"/>
+                <w:color w:val="000000"/>
+                <w:kern w:val="2"/>
+                <w:sz w:val="24"/>
+                <w:szCs w:val="24"/>
+                <w:lang w:val="es-ES" w:eastAsia="en-US" w:bidi="ar-SA"/>
+              </w:rPr>
+              <w:t>4</w:t>
+            </w:r>
+          </w:p>
+        </w:tc>
+        <w:tc>
+          <w:tcPr>
+            <w:tcW w:w="3555" w:type="dxa"/>
+            <w:tcBorders>
+              <w:top w:val="nil"/>
+            </w:tcBorders>
+          </w:tcPr>
+          <w:p>
+            <w:pPr>
+              <w:pStyle w:val="Normal"/>
+              <w:widowControl w:val="false"/>
+              <w:suppressAutoHyphens w:val="true"/>
+              <w:spacing w:lineRule="auto" w:line="240" w:before="0" w:after="0"/>
+              <w:jc w:val="center"/>
+              <w:rPr>
+                <w:rFonts w:ascii="Arial" w:hAnsi="Arial" w:eastAsia="Aptos" w:cs=""/>
+                <w:i w:val="false"/>
+                <w:i w:val="false"/>
+                <w:iCs w:val="false"/>
+                <w:color w:val="000000"/>
+                <w:kern w:val="2"/>
+                <w:sz w:val="24"/>
+                <w:szCs w:val="24"/>
+                <w:lang w:val="es-ES" w:eastAsia="en-US" w:bidi="ar-SA"/>
+              </w:rPr>
+            </w:pPr>
+            <w:r>
+              <w:rPr>
+                <w:rFonts w:eastAsia="Aptos" w:cs="" w:ascii="Arial" w:hAnsi="Arial"/>
+                <w:i w:val="false"/>
+                <w:iCs w:val="false"/>
+                <w:color w:val="000000"/>
+                <w:kern w:val="2"/>
+                <w:sz w:val="24"/>
+                <w:szCs w:val="24"/>
+                <w:lang w:val="es-ES" w:eastAsia="en-US" w:bidi="ar-SA"/>
+              </w:rPr>
+              <w:t>Cero</w:t>
+            </w:r>
+          </w:p>
+        </w:tc>
+        <w:tc>
+          <w:tcPr>
+            <w:tcW w:w="2627" w:type="dxa"/>
+            <w:vMerge w:val="continue"/>
             <w:tcBorders/>
           </w:tcPr>
           <w:p>
@@ -1114,27 +1446,200 @@
               <w:jc w:val="center"/>
               <w:rPr>
                 <w:rFonts w:ascii="Arial" w:hAnsi="Arial" w:eastAsia="Aptos" w:cs=""/>
-                <w:kern w:val="2"/>
-                <w:sz w:val="24"/>
-                <w:szCs w:val="24"/>
-                <w:lang w:val="es-ES" w:eastAsia="en-US" w:bidi="ar-SA"/>
-              </w:rPr>
-            </w:pPr>
-            <w:r>
-              <w:rPr>
-                <w:rFonts w:eastAsia="Aptos" w:cs="" w:ascii="Arial" w:hAnsi="Arial"/>
-                <w:kern w:val="2"/>
-                <w:sz w:val="24"/>
-                <w:szCs w:val="24"/>
-                <w:lang w:val="es-ES" w:eastAsia="en-US" w:bidi="ar-SA"/>
-              </w:rPr>
-              <w:t>Geometria.java, MenuGeometria.java</w:t>
-            </w:r>
-          </w:p>
-        </w:tc>
-        <w:tc>
-          <w:tcPr>
-            <w:tcW w:w="1919" w:type="dxa"/>
+                <w:i w:val="false"/>
+                <w:i w:val="false"/>
+                <w:iCs w:val="false"/>
+                <w:color w:val="000000"/>
+                <w:kern w:val="2"/>
+                <w:sz w:val="24"/>
+                <w:szCs w:val="24"/>
+                <w:lang w:val="es-ES" w:eastAsia="en-US" w:bidi="ar-SA"/>
+              </w:rPr>
+            </w:pPr>
+            <w:r>
+              <w:rPr>
+                <w:rFonts w:eastAsia="Aptos" w:cs="" w:ascii="Arial" w:hAnsi="Arial"/>
+                <w:i w:val="false"/>
+                <w:iCs w:val="false"/>
+                <w:color w:val="000000"/>
+                <w:kern w:val="2"/>
+                <w:sz w:val="24"/>
+                <w:szCs w:val="24"/>
+                <w:lang w:val="es-ES" w:eastAsia="en-US" w:bidi="ar-SA"/>
+              </w:rPr>
+            </w:r>
+          </w:p>
+        </w:tc>
+        <w:tc>
+          <w:tcPr>
+            <w:tcW w:w="1918" w:type="dxa"/>
+            <w:tcBorders>
+              <w:top w:val="nil"/>
+            </w:tcBorders>
+          </w:tcPr>
+          <w:p>
+            <w:pPr>
+              <w:pStyle w:val="Normal"/>
+              <w:widowControl w:val="false"/>
+              <w:suppressAutoHyphens w:val="true"/>
+              <w:spacing w:lineRule="auto" w:line="240" w:before="0" w:after="0"/>
+              <w:jc w:val="center"/>
+              <w:rPr>
+                <w:rFonts w:ascii="Arial" w:hAnsi="Arial" w:eastAsia="Aptos" w:cs=""/>
+                <w:i w:val="false"/>
+                <w:i w:val="false"/>
+                <w:iCs w:val="false"/>
+                <w:color w:val="000000"/>
+                <w:kern w:val="2"/>
+                <w:sz w:val="24"/>
+                <w:szCs w:val="24"/>
+                <w:lang w:val="es-ES" w:eastAsia="en-US" w:bidi="ar-SA"/>
+              </w:rPr>
+            </w:pPr>
+            <w:r>
+              <w:rPr>
+                <w:rFonts w:eastAsia="Aptos" w:cs="" w:ascii="Arial" w:hAnsi="Arial"/>
+                <w:i w:val="false"/>
+                <w:iCs w:val="false"/>
+                <w:color w:val="000000"/>
+                <w:kern w:val="2"/>
+                <w:sz w:val="24"/>
+                <w:szCs w:val="24"/>
+                <w:lang w:val="es-ES" w:eastAsia="en-US" w:bidi="ar-SA"/>
+              </w:rPr>
+              <w:t>0.0</w:t>
+            </w:r>
+          </w:p>
+        </w:tc>
+        <w:tc>
+          <w:tcPr>
+            <w:tcW w:w="2323" w:type="dxa"/>
+            <w:tcBorders>
+              <w:top w:val="nil"/>
+            </w:tcBorders>
+          </w:tcPr>
+          <w:p>
+            <w:pPr>
+              <w:pStyle w:val="Normal"/>
+              <w:widowControl w:val="false"/>
+              <w:suppressAutoHyphens w:val="true"/>
+              <w:spacing w:lineRule="auto" w:line="240" w:before="0" w:after="0"/>
+              <w:jc w:val="center"/>
+              <w:rPr>
+                <w:rFonts w:ascii="Arial" w:hAnsi="Arial" w:eastAsia="Aptos" w:cs=""/>
+                <w:i w:val="false"/>
+                <w:i w:val="false"/>
+                <w:iCs w:val="false"/>
+                <w:color w:val="000000"/>
+                <w:kern w:val="2"/>
+                <w:sz w:val="24"/>
+                <w:szCs w:val="24"/>
+                <w:lang w:val="es-ES" w:eastAsia="en-US" w:bidi="ar-SA"/>
+              </w:rPr>
+            </w:pPr>
+            <w:r>
+              <w:rPr>
+                <w:rFonts w:eastAsia="Aptos" w:cs="" w:ascii="Arial" w:hAnsi="Arial"/>
+                <w:i w:val="false"/>
+                <w:iCs w:val="false"/>
+                <w:color w:val="000000"/>
+                <w:kern w:val="2"/>
+                <w:sz w:val="24"/>
+                <w:szCs w:val="24"/>
+                <w:lang w:val="es-ES" w:eastAsia="en-US" w:bidi="ar-SA"/>
+              </w:rPr>
+            </w:r>
+          </w:p>
+        </w:tc>
+      </w:tr>
+      <w:tr>
+        <w:trPr/>
+        <w:tc>
+          <w:tcPr>
+            <w:tcW w:w="673" w:type="dxa"/>
+            <w:tcBorders>
+              <w:top w:val="nil"/>
+            </w:tcBorders>
+          </w:tcPr>
+          <w:p>
+            <w:pPr>
+              <w:pStyle w:val="Normal"/>
+              <w:widowControl w:val="false"/>
+              <w:suppressAutoHyphens w:val="true"/>
+              <w:spacing w:lineRule="auto" w:line="240" w:before="0" w:after="0"/>
+              <w:jc w:val="center"/>
+              <w:rPr>
+                <w:rFonts w:ascii="Arial" w:hAnsi="Arial" w:eastAsia="Aptos" w:cs=""/>
+                <w:i w:val="false"/>
+                <w:i w:val="false"/>
+                <w:iCs w:val="false"/>
+                <w:color w:val="000000"/>
+                <w:kern w:val="2"/>
+                <w:sz w:val="24"/>
+                <w:szCs w:val="24"/>
+                <w:lang w:val="es-ES" w:eastAsia="en-US" w:bidi="ar-SA"/>
+              </w:rPr>
+            </w:pPr>
+            <w:r>
+              <w:rPr>
+                <w:rFonts w:eastAsia="Aptos" w:cs="" w:ascii="Arial" w:hAnsi="Arial"/>
+                <w:i w:val="false"/>
+                <w:iCs w:val="false"/>
+                <w:color w:val="000000"/>
+                <w:kern w:val="2"/>
+                <w:sz w:val="24"/>
+                <w:szCs w:val="24"/>
+                <w:lang w:val="es-ES" w:eastAsia="en-US" w:bidi="ar-SA"/>
+              </w:rPr>
+              <w:t>5</w:t>
+            </w:r>
+          </w:p>
+        </w:tc>
+        <w:tc>
+          <w:tcPr>
+            <w:tcW w:w="3555" w:type="dxa"/>
+            <w:tcBorders>
+              <w:top w:val="nil"/>
+            </w:tcBorders>
+          </w:tcPr>
+          <w:p>
+            <w:pPr>
+              <w:pStyle w:val="Normal"/>
+              <w:widowControl w:val="false"/>
+              <w:suppressAutoHyphens w:val="true"/>
+              <w:spacing w:lineRule="auto" w:line="240" w:before="0" w:after="0"/>
+              <w:jc w:val="center"/>
+              <w:rPr>
+                <w:rFonts w:ascii="Arial" w:hAnsi="Arial" w:eastAsia="Aptos" w:cs=""/>
+                <w:i w:val="false"/>
+                <w:i w:val="false"/>
+                <w:iCs w:val="false"/>
+                <w:color w:val="000000"/>
+                <w:kern w:val="2"/>
+                <w:sz w:val="24"/>
+                <w:szCs w:val="24"/>
+                <w:lang w:val="es-ES" w:eastAsia="en-US" w:bidi="ar-SA"/>
+              </w:rPr>
+            </w:pPr>
+            <w:r>
+              <w:rPr>
+                <w:rFonts w:eastAsia="Aptos" w:cs="" w:ascii="Arial" w:hAnsi="Arial"/>
+                <w:i w:val="false"/>
+                <w:iCs w:val="false"/>
+                <w:color w:val="000000"/>
+                <w:kern w:val="2"/>
+                <w:sz w:val="24"/>
+                <w:szCs w:val="24"/>
+                <w:lang w:val="es-ES" w:eastAsia="en-US" w:bidi="ar-SA"/>
+              </w:rPr>
+              <w:t>Valor negativo</w:t>
+            </w:r>
+          </w:p>
+        </w:tc>
+        <w:tc>
+          <w:tcPr>
+            <w:tcW w:w="2627" w:type="dxa"/>
+            <w:vMerge w:val="continue"/>
             <w:tcBorders/>
           </w:tcPr>
           <w:p>
@@ -1146,27 +1651,213 @@
               <w:jc w:val="center"/>
               <w:rPr>
                 <w:rFonts w:ascii="Arial" w:hAnsi="Arial" w:eastAsia="Aptos" w:cs=""/>
-                <w:kern w:val="2"/>
-                <w:sz w:val="24"/>
-                <w:szCs w:val="24"/>
-                <w:lang w:val="es-ES" w:eastAsia="en-US" w:bidi="ar-SA"/>
-              </w:rPr>
-            </w:pPr>
-            <w:r>
-              <w:rPr>
-                <w:rFonts w:eastAsia="Aptos" w:cs="" w:ascii="Arial" w:hAnsi="Arial"/>
-                <w:kern w:val="2"/>
-                <w:sz w:val="24"/>
-                <w:szCs w:val="24"/>
-                <w:lang w:val="es-ES" w:eastAsia="en-US" w:bidi="ar-SA"/>
-              </w:rPr>
-              <w:t>-1 y mensaje de resultado no valido</w:t>
-            </w:r>
-          </w:p>
-        </w:tc>
-        <w:tc>
-          <w:tcPr>
-            <w:tcW w:w="2322" w:type="dxa"/>
+                <w:i w:val="false"/>
+                <w:i w:val="false"/>
+                <w:iCs w:val="false"/>
+                <w:color w:val="000000"/>
+                <w:kern w:val="2"/>
+                <w:sz w:val="24"/>
+                <w:szCs w:val="24"/>
+                <w:lang w:val="es-ES" w:eastAsia="en-US" w:bidi="ar-SA"/>
+              </w:rPr>
+            </w:pPr>
+            <w:r>
+              <w:rPr>
+                <w:rFonts w:eastAsia="Aptos" w:cs="" w:ascii="Arial" w:hAnsi="Arial"/>
+                <w:i w:val="false"/>
+                <w:iCs w:val="false"/>
+                <w:color w:val="000000"/>
+                <w:kern w:val="2"/>
+                <w:sz w:val="24"/>
+                <w:szCs w:val="24"/>
+                <w:lang w:val="es-ES" w:eastAsia="en-US" w:bidi="ar-SA"/>
+              </w:rPr>
+            </w:r>
+          </w:p>
+        </w:tc>
+        <w:tc>
+          <w:tcPr>
+            <w:tcW w:w="1918" w:type="dxa"/>
+            <w:tcBorders>
+              <w:top w:val="nil"/>
+            </w:tcBorders>
+          </w:tcPr>
+          <w:p>
+            <w:pPr>
+              <w:pStyle w:val="Normal"/>
+              <w:widowControl w:val="false"/>
+              <w:suppressAutoHyphens w:val="true"/>
+              <w:spacing w:lineRule="auto" w:line="240" w:before="0" w:after="0"/>
+              <w:jc w:val="center"/>
+              <w:rPr>
+                <w:rFonts w:ascii="Arial" w:hAnsi="Arial" w:eastAsia="Aptos" w:cs=""/>
+                <w:i w:val="false"/>
+                <w:i w:val="false"/>
+                <w:iCs w:val="false"/>
+                <w:color w:val="000000"/>
+                <w:kern w:val="2"/>
+                <w:sz w:val="24"/>
+                <w:szCs w:val="24"/>
+                <w:lang w:val="es-ES" w:eastAsia="en-US" w:bidi="ar-SA"/>
+              </w:rPr>
+            </w:pPr>
+            <w:r>
+              <w:rPr>
+                <w:rFonts w:eastAsia="Aptos" w:cs="" w:ascii="Arial" w:hAnsi="Arial"/>
+                <w:i w:val="false"/>
+                <w:iCs w:val="false"/>
+                <w:color w:val="000000"/>
+                <w:kern w:val="2"/>
+                <w:sz w:val="24"/>
+                <w:szCs w:val="24"/>
+                <w:lang w:val="es-ES" w:eastAsia="en-US" w:bidi="ar-SA"/>
+              </w:rPr>
+              <w:t>-</w:t>
+            </w:r>
+            <w:r>
+              <w:rPr>
+                <w:rFonts w:eastAsia="Aptos" w:cs="" w:ascii="Arial" w:hAnsi="Arial"/>
+                <w:i w:val="false"/>
+                <w:iCs w:val="false"/>
+                <w:color w:val="000000"/>
+                <w:kern w:val="2"/>
+                <w:sz w:val="24"/>
+                <w:szCs w:val="24"/>
+                <w:lang w:val="es-ES" w:eastAsia="en-US" w:bidi="ar-SA"/>
+              </w:rPr>
+              <w:t>3.2</w:t>
+            </w:r>
+          </w:p>
+        </w:tc>
+        <w:tc>
+          <w:tcPr>
+            <w:tcW w:w="2323" w:type="dxa"/>
+            <w:tcBorders>
+              <w:top w:val="nil"/>
+            </w:tcBorders>
+          </w:tcPr>
+          <w:p>
+            <w:pPr>
+              <w:pStyle w:val="Normal"/>
+              <w:widowControl w:val="false"/>
+              <w:suppressAutoHyphens w:val="true"/>
+              <w:spacing w:lineRule="auto" w:line="240" w:before="0" w:after="0"/>
+              <w:jc w:val="center"/>
+              <w:rPr>
+                <w:rFonts w:ascii="Arial" w:hAnsi="Arial" w:eastAsia="Aptos" w:cs=""/>
+                <w:i w:val="false"/>
+                <w:i w:val="false"/>
+                <w:iCs w:val="false"/>
+                <w:color w:val="000000"/>
+                <w:kern w:val="2"/>
+                <w:sz w:val="24"/>
+                <w:szCs w:val="24"/>
+                <w:lang w:val="es-ES" w:eastAsia="en-US" w:bidi="ar-SA"/>
+              </w:rPr>
+            </w:pPr>
+            <w:r>
+              <w:rPr>
+                <w:rFonts w:eastAsia="Aptos" w:cs="" w:ascii="Arial" w:hAnsi="Arial"/>
+                <w:i w:val="false"/>
+                <w:iCs w:val="false"/>
+                <w:color w:val="000000"/>
+                <w:kern w:val="2"/>
+                <w:sz w:val="24"/>
+                <w:szCs w:val="24"/>
+                <w:lang w:val="es-ES" w:eastAsia="en-US" w:bidi="ar-SA"/>
+              </w:rPr>
+            </w:r>
+          </w:p>
+        </w:tc>
+      </w:tr>
+      <w:tr>
+        <w:trPr/>
+        <w:tc>
+          <w:tcPr>
+            <w:tcW w:w="673" w:type="dxa"/>
+            <w:tcBorders>
+              <w:top w:val="nil"/>
+            </w:tcBorders>
+          </w:tcPr>
+          <w:p>
+            <w:pPr>
+              <w:pStyle w:val="Normal"/>
+              <w:widowControl w:val="false"/>
+              <w:suppressAutoHyphens w:val="true"/>
+              <w:spacing w:lineRule="auto" w:line="240" w:before="0" w:after="0"/>
+              <w:jc w:val="center"/>
+              <w:rPr>
+                <w:rFonts w:ascii="Arial" w:hAnsi="Arial" w:eastAsia="Aptos" w:cs=""/>
+                <w:i w:val="false"/>
+                <w:i w:val="false"/>
+                <w:iCs w:val="false"/>
+                <w:color w:val="000000"/>
+                <w:kern w:val="2"/>
+                <w:sz w:val="24"/>
+                <w:szCs w:val="24"/>
+                <w:lang w:val="es-ES" w:eastAsia="en-US" w:bidi="ar-SA"/>
+              </w:rPr>
+            </w:pPr>
+            <w:r>
+              <w:rPr>
+                <w:rFonts w:eastAsia="Aptos" w:cs="" w:ascii="Arial" w:hAnsi="Arial"/>
+                <w:i w:val="false"/>
+                <w:iCs w:val="false"/>
+                <w:color w:val="000000"/>
+                <w:kern w:val="2"/>
+                <w:sz w:val="24"/>
+                <w:szCs w:val="24"/>
+                <w:lang w:val="es-ES" w:eastAsia="en-US" w:bidi="ar-SA"/>
+              </w:rPr>
+              <w:t>6</w:t>
+            </w:r>
+          </w:p>
+        </w:tc>
+        <w:tc>
+          <w:tcPr>
+            <w:tcW w:w="3555" w:type="dxa"/>
+            <w:tcBorders>
+              <w:top w:val="nil"/>
+            </w:tcBorders>
+          </w:tcPr>
+          <w:p>
+            <w:pPr>
+              <w:pStyle w:val="Normal"/>
+              <w:widowControl w:val="false"/>
+              <w:suppressAutoHyphens w:val="true"/>
+              <w:spacing w:lineRule="auto" w:line="240" w:before="0" w:after="0"/>
+              <w:jc w:val="center"/>
+              <w:rPr>
+                <w:rFonts w:ascii="Arial" w:hAnsi="Arial" w:eastAsia="Aptos" w:cs=""/>
+                <w:i w:val="false"/>
+                <w:i w:val="false"/>
+                <w:iCs w:val="false"/>
+                <w:color w:val="000000"/>
+                <w:kern w:val="2"/>
+                <w:sz w:val="24"/>
+                <w:szCs w:val="24"/>
+                <w:lang w:val="es-ES" w:eastAsia="en-US" w:bidi="ar-SA"/>
+              </w:rPr>
+            </w:pPr>
+            <w:r>
+              <w:rPr>
+                <w:rFonts w:eastAsia="Aptos" w:cs="" w:ascii="Arial" w:hAnsi="Arial"/>
+                <w:i w:val="false"/>
+                <w:iCs w:val="false"/>
+                <w:color w:val="000000"/>
+                <w:kern w:val="2"/>
+                <w:sz w:val="24"/>
+                <w:szCs w:val="24"/>
+                <w:lang w:val="es-ES" w:eastAsia="en-US" w:bidi="ar-SA"/>
+              </w:rPr>
+              <w:t>Maxima precision</w:t>
+            </w:r>
+          </w:p>
+        </w:tc>
+        <w:tc>
+          <w:tcPr>
+            <w:tcW w:w="2627" w:type="dxa"/>
+            <w:vMerge w:val="continue"/>
             <w:tcBorders/>
           </w:tcPr>
           <w:p>
@@ -1178,15 +1869,103 @@
               <w:jc w:val="center"/>
               <w:rPr>
                 <w:rFonts w:ascii="Arial" w:hAnsi="Arial" w:eastAsia="Aptos" w:cs=""/>
-                <w:kern w:val="2"/>
-                <w:sz w:val="24"/>
-                <w:szCs w:val="24"/>
-                <w:lang w:val="es-ES" w:eastAsia="en-US" w:bidi="ar-SA"/>
-              </w:rPr>
-            </w:pPr>
-            <w:r>
-              <w:rPr>
-                <w:rFonts w:eastAsia="Aptos" w:cs="" w:ascii="Arial" w:hAnsi="Arial"/>
+                <w:i w:val="false"/>
+                <w:i w:val="false"/>
+                <w:iCs w:val="false"/>
+                <w:color w:val="000000"/>
+                <w:kern w:val="2"/>
+                <w:sz w:val="24"/>
+                <w:szCs w:val="24"/>
+                <w:lang w:val="es-ES" w:eastAsia="en-US" w:bidi="ar-SA"/>
+              </w:rPr>
+            </w:pPr>
+            <w:r>
+              <w:rPr>
+                <w:rFonts w:eastAsia="Aptos" w:cs="" w:ascii="Arial" w:hAnsi="Arial"/>
+                <w:i w:val="false"/>
+                <w:iCs w:val="false"/>
+                <w:color w:val="000000"/>
+                <w:kern w:val="2"/>
+                <w:sz w:val="24"/>
+                <w:szCs w:val="24"/>
+                <w:lang w:val="es-ES" w:eastAsia="en-US" w:bidi="ar-SA"/>
+              </w:rPr>
+            </w:r>
+          </w:p>
+        </w:tc>
+        <w:tc>
+          <w:tcPr>
+            <w:tcW w:w="1918" w:type="dxa"/>
+            <w:tcBorders>
+              <w:top w:val="nil"/>
+            </w:tcBorders>
+          </w:tcPr>
+          <w:p>
+            <w:pPr>
+              <w:pStyle w:val="Normal"/>
+              <w:widowControl w:val="false"/>
+              <w:suppressAutoHyphens w:val="true"/>
+              <w:spacing w:lineRule="auto" w:line="240" w:before="0" w:after="0"/>
+              <w:jc w:val="center"/>
+              <w:rPr>
+                <w:rFonts w:ascii="Arial" w:hAnsi="Arial" w:eastAsia="Aptos" w:cs=""/>
+                <w:i w:val="false"/>
+                <w:i w:val="false"/>
+                <w:iCs w:val="false"/>
+                <w:color w:val="000000"/>
+                <w:kern w:val="2"/>
+                <w:sz w:val="24"/>
+                <w:szCs w:val="24"/>
+                <w:lang w:val="es-ES" w:eastAsia="en-US" w:bidi="ar-SA"/>
+              </w:rPr>
+            </w:pPr>
+            <w:r>
+              <w:rPr>
+                <w:rFonts w:eastAsia="Aptos" w:cs="" w:ascii="Arial" w:hAnsi="Arial"/>
+                <w:i w:val="false"/>
+                <w:iCs w:val="false"/>
+                <w:color w:val="000000"/>
+                <w:kern w:val="2"/>
+                <w:sz w:val="24"/>
+                <w:szCs w:val="24"/>
+                <w:lang w:val="es-ES" w:eastAsia="en-US" w:bidi="ar-SA"/>
+              </w:rPr>
+              <w:t>123.4567</w:t>
+            </w:r>
+          </w:p>
+        </w:tc>
+        <w:tc>
+          <w:tcPr>
+            <w:tcW w:w="2323" w:type="dxa"/>
+            <w:tcBorders>
+              <w:top w:val="nil"/>
+            </w:tcBorders>
+          </w:tcPr>
+          <w:p>
+            <w:pPr>
+              <w:pStyle w:val="Normal"/>
+              <w:widowControl w:val="false"/>
+              <w:suppressAutoHyphens w:val="true"/>
+              <w:spacing w:lineRule="auto" w:line="240" w:before="0" w:after="0"/>
+              <w:jc w:val="center"/>
+              <w:rPr>
+                <w:rFonts w:ascii="Arial" w:hAnsi="Arial" w:eastAsia="Aptos" w:cs=""/>
+                <w:i w:val="false"/>
+                <w:i w:val="false"/>
+                <w:iCs w:val="false"/>
+                <w:color w:val="000000"/>
+                <w:kern w:val="2"/>
+                <w:sz w:val="24"/>
+                <w:szCs w:val="24"/>
+                <w:lang w:val="es-ES" w:eastAsia="en-US" w:bidi="ar-SA"/>
+              </w:rPr>
+            </w:pPr>
+            <w:r>
+              <w:rPr>
+                <w:rFonts w:eastAsia="Aptos" w:cs="" w:ascii="Arial" w:hAnsi="Arial"/>
+                <w:i w:val="false"/>
+                <w:iCs w:val="false"/>
+                <w:color w:val="000000"/>
                 <w:kern w:val="2"/>
                 <w:sz w:val="24"/>
                 <w:szCs w:val="24"/>
@@ -1202,6 +1981,10 @@
         <w:pStyle w:val="Normal"/>
         <w:rPr>
           <w:rFonts w:ascii="Arial" w:hAnsi="Arial"/>
+          <w:i w:val="false"/>
+          <w:i w:val="false"/>
+          <w:iCs w:val="false"/>
+          <w:color w:val="000000"/>
           <w:sz w:val="24"/>
           <w:szCs w:val="24"/>
         </w:rPr>
@@ -1209,6 +1992,9 @@
       <w:r>
         <w:rPr>
           <w:rFonts w:ascii="Arial" w:hAnsi="Arial"/>
+          <w:i w:val="false"/>
+          <w:iCs w:val="false"/>
+          <w:color w:val="000000"/>
           <w:sz w:val="24"/>
           <w:szCs w:val="24"/>
         </w:rPr>
@@ -1219,6 +2005,10 @@
         <w:pStyle w:val="Normal"/>
         <w:rPr>
           <w:rFonts w:ascii="Arial" w:hAnsi="Arial"/>
+          <w:i w:val="false"/>
+          <w:i w:val="false"/>
+          <w:iCs w:val="false"/>
+          <w:color w:val="000000"/>
           <w:sz w:val="24"/>
           <w:szCs w:val="24"/>
         </w:rPr>
@@ -1226,10 +2016,13 @@
       <w:r>
         <w:rPr>
           <w:rFonts w:ascii="Arial" w:hAnsi="Arial"/>
+          <w:i w:val="false"/>
+          <w:iCs w:val="false"/>
+          <w:color w:val="000000"/>
           <w:sz w:val="24"/>
           <w:szCs w:val="24"/>
         </w:rPr>
-        <w:t>Resultado final: OK/KO</w:t>
+        <w:t xml:space="preserve">Resultado final: </w:t>
       </w:r>
     </w:p>
     <w:p>
@@ -1238,6 +2031,10 @@
         <w:spacing w:before="0" w:after="160"/>
         <w:rPr>
           <w:rFonts w:ascii="Arial" w:hAnsi="Arial"/>
+          <w:i w:val="false"/>
+          <w:i w:val="false"/>
+          <w:iCs w:val="false"/>
+          <w:color w:val="000000"/>
           <w:sz w:val="24"/>
           <w:szCs w:val="24"/>
         </w:rPr>
@@ -1245,10 +2042,13 @@
       <w:r>
         <w:rPr>
           <w:rFonts w:ascii="Arial" w:hAnsi="Arial"/>
+          <w:i w:val="false"/>
+          <w:iCs w:val="false"/>
+          <w:color w:val="000000"/>
           <w:sz w:val="24"/>
           <w:szCs w:val="24"/>
         </w:rPr>
-        <w:t>Observaciones: Ninguna</w:t>
+        <w:t xml:space="preserve">Observaciones: </w:t>
       </w:r>
     </w:p>
     <w:sectPr>
@@ -1681,7 +2481,7 @@
       <w14:ligatures w14:val="standardContextual"/>
     </w:rPr>
   </w:style>
-  <w:style w:type="paragraph" w:styleId="Ttulo1">
+  <w:style w:type="paragraph" w:styleId="Heading1">
     <w:name w:val="Heading 1"/>
     <w:basedOn w:val="Normal"/>
     <w:next w:val="Normal"/>
@@ -1697,12 +2497,12 @@
     </w:pPr>
     <w:rPr>
       <w:rFonts w:ascii="Aptos Display" w:hAnsi="Aptos Display" w:eastAsia="" w:cs="" w:asciiTheme="majorHAnsi" w:cstheme="majorBidi" w:eastAsiaTheme="majorEastAsia" w:hAnsiTheme="majorHAnsi"/>
-      <w:color w:val="0F4761" w:themeColor="accent1" w:themeShade="bf"/>
+      <w:color w:themeColor="accent1" w:themeShade="bf" w:val="0F4761"/>
       <w:sz w:val="40"/>
       <w:szCs w:val="40"/>
     </w:rPr>
   </w:style>
-  <w:style w:type="paragraph" w:styleId="Ttulo2">
+  <w:style w:type="paragraph" w:styleId="Heading2">
     <w:name w:val="Heading 2"/>
     <w:basedOn w:val="Normal"/>
     <w:next w:val="Normal"/>
@@ -1720,12 +2520,12 @@
     </w:pPr>
     <w:rPr>
       <w:rFonts w:ascii="Aptos Display" w:hAnsi="Aptos Display" w:eastAsia="" w:cs="" w:asciiTheme="majorHAnsi" w:cstheme="majorBidi" w:eastAsiaTheme="majorEastAsia" w:hAnsiTheme="majorHAnsi"/>
-      <w:color w:val="0F4761" w:themeColor="accent1" w:themeShade="bf"/>
+      <w:color w:themeColor="accent1" w:themeShade="bf" w:val="0F4761"/>
       <w:sz w:val="32"/>
       <w:szCs w:val="32"/>
     </w:rPr>
   </w:style>
-  <w:style w:type="paragraph" w:styleId="Ttulo3">
+  <w:style w:type="paragraph" w:styleId="Heading3">
     <w:name w:val="Heading 3"/>
     <w:basedOn w:val="Normal"/>
     <w:next w:val="Normal"/>
@@ -1743,12 +2543,12 @@
     </w:pPr>
     <w:rPr>
       <w:rFonts w:eastAsia="" w:cs="" w:cstheme="majorBidi" w:eastAsiaTheme="majorEastAsia"/>
-      <w:color w:val="0F4761" w:themeColor="accent1" w:themeShade="bf"/>
+      <w:color w:themeColor="accent1" w:themeShade="bf" w:val="0F4761"/>
       <w:sz w:val="28"/>
       <w:szCs w:val="28"/>
     </w:rPr>
   </w:style>
-  <w:style w:type="paragraph" w:styleId="Ttulo4">
+  <w:style w:type="paragraph" w:styleId="Heading4">
     <w:name w:val="Heading 4"/>
     <w:basedOn w:val="Normal"/>
     <w:next w:val="Normal"/>
@@ -1768,10 +2568,10 @@
       <w:rFonts w:eastAsia="" w:cs="" w:cstheme="majorBidi" w:eastAsiaTheme="majorEastAsia"/>
       <w:i/>
       <w:iCs/>
-      <w:color w:val="0F4761" w:themeColor="accent1" w:themeShade="bf"/>
-    </w:rPr>
-  </w:style>
-  <w:style w:type="paragraph" w:styleId="Ttulo5">
+      <w:color w:themeColor="accent1" w:themeShade="bf" w:val="0F4761"/>
+    </w:rPr>
+  </w:style>
+  <w:style w:type="paragraph" w:styleId="Heading5">
     <w:name w:val="Heading 5"/>
     <w:basedOn w:val="Normal"/>
     <w:next w:val="Normal"/>
@@ -1789,10 +2589,10 @@
     </w:pPr>
     <w:rPr>
       <w:rFonts w:eastAsia="" w:cs="" w:cstheme="majorBidi" w:eastAsiaTheme="majorEastAsia"/>
-      <w:color w:val="0F4761" w:themeColor="accent1" w:themeShade="bf"/>
-    </w:rPr>
-  </w:style>
-  <w:style w:type="paragraph" w:styleId="Ttulo6">
+      <w:color w:themeColor="accent1" w:themeShade="bf" w:val="0F4761"/>
+    </w:rPr>
+  </w:style>
+  <w:style w:type="paragraph" w:styleId="Heading6">
     <w:name w:val="Heading 6"/>
     <w:basedOn w:val="Normal"/>
     <w:next w:val="Normal"/>
@@ -1812,10 +2612,10 @@
       <w:rFonts w:eastAsia="" w:cs="" w:cstheme="majorBidi" w:eastAsiaTheme="majorEastAsia"/>
       <w:i/>
       <w:iCs/>
-      <w:color w:val="595959" w:themeColor="text1" w:themeTint="a6"/>
-    </w:rPr>
-  </w:style>
-  <w:style w:type="paragraph" w:styleId="Ttulo7">
+      <w:color w:themeColor="text1" w:themeTint="a6" w:val="595959"/>
+    </w:rPr>
+  </w:style>
+  <w:style w:type="paragraph" w:styleId="Heading7">
     <w:name w:val="Heading 7"/>
     <w:basedOn w:val="Normal"/>
     <w:next w:val="Normal"/>
@@ -1833,10 +2633,10 @@
     </w:pPr>
     <w:rPr>
       <w:rFonts w:eastAsia="" w:cs="" w:cstheme="majorBidi" w:eastAsiaTheme="majorEastAsia"/>
-      <w:color w:val="595959" w:themeColor="text1" w:themeTint="a6"/>
-    </w:rPr>
-  </w:style>
-  <w:style w:type="paragraph" w:styleId="Ttulo8">
+      <w:color w:themeColor="text1" w:themeTint="a6" w:val="595959"/>
+    </w:rPr>
+  </w:style>
+  <w:style w:type="paragraph" w:styleId="Heading8">
     <w:name w:val="Heading 8"/>
     <w:basedOn w:val="Normal"/>
     <w:next w:val="Normal"/>
@@ -1856,10 +2656,10 @@
       <w:rFonts w:eastAsia="" w:cs="" w:cstheme="majorBidi" w:eastAsiaTheme="majorEastAsia"/>
       <w:i/>
       <w:iCs/>
-      <w:color w:val="272727" w:themeColor="text1" w:themeTint="d8"/>
-    </w:rPr>
-  </w:style>
-  <w:style w:type="paragraph" w:styleId="Ttulo9">
+      <w:color w:themeColor="text1" w:themeTint="d8" w:val="272727"/>
+    </w:rPr>
+  </w:style>
+  <w:style w:type="paragraph" w:styleId="Heading9">
     <w:name w:val="Heading 9"/>
     <w:basedOn w:val="Normal"/>
     <w:next w:val="Normal"/>
@@ -1877,7 +2677,7 @@
     </w:pPr>
     <w:rPr>
       <w:rFonts w:eastAsia="" w:cs="" w:cstheme="majorBidi" w:eastAsiaTheme="majorEastAsia"/>
-      <w:color w:val="272727" w:themeColor="text1" w:themeTint="d8"/>
+      <w:color w:themeColor="text1" w:themeTint="d8" w:val="272727"/>
     </w:rPr>
   </w:style>
   <w:style w:type="character" w:styleId="DefaultParagraphFont" w:default="1">
@@ -1896,7 +2696,7 @@
     <w:rsid w:val="00800f65"/>
     <w:rPr>
       <w:rFonts w:ascii="Aptos Display" w:hAnsi="Aptos Display" w:eastAsia="" w:cs="" w:asciiTheme="majorHAnsi" w:cstheme="majorBidi" w:eastAsiaTheme="majorEastAsia" w:hAnsiTheme="majorHAnsi"/>
-      <w:color w:val="0F4761" w:themeColor="accent1" w:themeShade="bf"/>
+      <w:color w:themeColor="accent1" w:themeShade="bf" w:val="0F4761"/>
       <w:sz w:val="40"/>
       <w:szCs w:val="40"/>
     </w:rPr>
@@ -1910,7 +2710,7 @@
     <w:rsid w:val="00800f65"/>
     <w:rPr>
       <w:rFonts w:ascii="Aptos Display" w:hAnsi="Aptos Display" w:eastAsia="" w:cs="" w:asciiTheme="majorHAnsi" w:cstheme="majorBidi" w:eastAsiaTheme="majorEastAsia" w:hAnsiTheme="majorHAnsi"/>
-      <w:color w:val="0F4761" w:themeColor="accent1" w:themeShade="bf"/>
+      <w:color w:themeColor="accent1" w:themeShade="bf" w:val="0F4761"/>
       <w:sz w:val="32"/>
       <w:szCs w:val="32"/>
     </w:rPr>
@@ -1924,7 +2724,7 @@
     <w:rsid w:val="00800f65"/>
     <w:rPr>
       <w:rFonts w:eastAsia="" w:cs="" w:cstheme="majorBidi" w:eastAsiaTheme="majorEastAsia"/>
-      <w:color w:val="0F4761" w:themeColor="accent1" w:themeShade="bf"/>
+      <w:color w:themeColor="accent1" w:themeShade="bf" w:val="0F4761"/>
       <w:sz w:val="28"/>
       <w:szCs w:val="28"/>
     </w:rPr>
@@ -1940,7 +2740,7 @@
       <w:rFonts w:eastAsia="" w:cs="" w:cstheme="majorBidi" w:eastAsiaTheme="majorEastAsia"/>
       <w:i/>
       <w:iCs/>
-      <w:color w:val="0F4761" w:themeColor="accent1" w:themeShade="bf"/>
+      <w:color w:themeColor="accent1" w:themeShade="bf" w:val="0F4761"/>
     </w:rPr>
   </w:style>
   <w:style w:type="character" w:styleId="Ttulo5Car" w:customStyle="1">
@@ -1952,7 +2752,7 @@
     <w:rsid w:val="00800f65"/>
     <w:rPr>
       <w:rFonts w:eastAsia="" w:cs="" w:cstheme="majorBidi" w:eastAsiaTheme="majorEastAsia"/>
-      <w:color w:val="0F4761" w:themeColor="accent1" w:themeShade="bf"/>
+      <w:color w:themeColor="accent1" w:themeShade="bf" w:val="0F4761"/>
     </w:rPr>
   </w:style>
   <w:style w:type="character" w:styleId="Ttulo6Car" w:customStyle="1">
@@ -1966,7 +2766,7 @@
       <w:rFonts w:eastAsia="" w:cs="" w:cstheme="majorBidi" w:eastAsiaTheme="majorEastAsia"/>
       <w:i/>
       <w:iCs/>
-      <w:color w:val="595959" w:themeColor="text1" w:themeTint="a6"/>
+      <w:color w:themeColor="text1" w:themeTint="a6" w:val="595959"/>
     </w:rPr>
   </w:style>
   <w:style w:type="character" w:styleId="Ttulo7Car" w:customStyle="1">
@@ -1978,7 +2778,7 @@
     <w:rsid w:val="00800f65"/>
     <w:rPr>
       <w:rFonts w:eastAsia="" w:cs="" w:cstheme="majorBidi" w:eastAsiaTheme="majorEastAsia"/>
-      <w:color w:val="595959" w:themeColor="text1" w:themeTint="a6"/>
+      <w:color w:themeColor="text1" w:themeTint="a6" w:val="595959"/>
     </w:rPr>
   </w:style>
   <w:style w:type="character" w:styleId="Ttulo8Car" w:customStyle="1">
@@ -1992,7 +2792,7 @@
       <w:rFonts w:eastAsia="" w:cs="" w:cstheme="majorBidi" w:eastAsiaTheme="majorEastAsia"/>
       <w:i/>
       <w:iCs/>
-      <w:color w:val="272727" w:themeColor="text1" w:themeTint="d8"/>
+      <w:color w:themeColor="text1" w:themeTint="d8" w:val="272727"/>
     </w:rPr>
   </w:style>
   <w:style w:type="character" w:styleId="Ttulo9Car" w:customStyle="1">
@@ -2004,7 +2804,7 @@
     <w:rsid w:val="00800f65"/>
     <w:rPr>
       <w:rFonts w:eastAsia="" w:cs="" w:cstheme="majorBidi" w:eastAsiaTheme="majorEastAsia"/>
-      <w:color w:val="272727" w:themeColor="text1" w:themeTint="d8"/>
+      <w:color w:themeColor="text1" w:themeTint="d8" w:val="272727"/>
     </w:rPr>
   </w:style>
   <w:style w:type="character" w:styleId="TtuloCar" w:customStyle="1">
@@ -2029,7 +2829,7 @@
     <w:rsid w:val="00800f65"/>
     <w:rPr>
       <w:rFonts w:eastAsia="" w:cs="" w:cstheme="majorBidi" w:eastAsiaTheme="majorEastAsia"/>
-      <w:color w:val="595959" w:themeColor="text1" w:themeTint="a6"/>
+      <w:color w:themeColor="text1" w:themeTint="a6" w:val="595959"/>
       <w:spacing w:val="15"/>
       <w:sz w:val="28"/>
       <w:szCs w:val="28"/>
@@ -2045,7 +2845,7 @@
     <w:rPr>
       <w:i/>
       <w:iCs/>
-      <w:color w:val="404040" w:themeColor="text1" w:themeTint="bf"/>
+      <w:color w:themeColor="text1" w:themeTint="bf" w:val="404040"/>
     </w:rPr>
   </w:style>
   <w:style w:type="character" w:styleId="IntenseEmphasis">
@@ -2057,7 +2857,7 @@
     <w:rPr>
       <w:i/>
       <w:iCs/>
-      <w:color w:val="0F4761" w:themeColor="accent1" w:themeShade="bf"/>
+      <w:color w:themeColor="accent1" w:themeShade="bf" w:val="0F4761"/>
     </w:rPr>
   </w:style>
   <w:style w:type="character" w:styleId="CitadestacadaCar" w:customStyle="1">
@@ -2070,7 +2870,7 @@
     <w:rPr>
       <w:i/>
       <w:iCs/>
-      <w:color w:val="0F4761" w:themeColor="accent1" w:themeShade="bf"/>
+      <w:color w:themeColor="accent1" w:themeShade="bf" w:val="0F4761"/>
     </w:rPr>
   </w:style>
   <w:style w:type="character" w:styleId="IntenseReference">
@@ -2083,7 +2883,7 @@
       <w:b/>
       <w:bCs/>
       <w:smallCaps/>
-      <w:color w:val="0F4761" w:themeColor="accent1" w:themeShade="bf"/>
+      <w:color w:themeColor="accent1" w:themeShade="bf" w:val="0F4761"/>
       <w:spacing w:val="5"/>
     </w:rPr>
   </w:style>
@@ -2105,7 +2905,7 @@
   <w:style w:type="paragraph" w:styleId="Ttulo">
     <w:name w:val="Título"/>
     <w:basedOn w:val="Normal"/>
-    <w:next w:val="Cuerpodetexto"/>
+    <w:next w:val="BodyText"/>
     <w:qFormat/>
     <w:pPr>
       <w:keepNext w:val="true"/>
@@ -2117,7 +2917,7 @@
       <w:szCs w:val="28"/>
     </w:rPr>
   </w:style>
-  <w:style w:type="paragraph" w:styleId="Cuerpodetexto">
+  <w:style w:type="paragraph" w:styleId="BodyText">
     <w:name w:val="Body Text"/>
     <w:basedOn w:val="Normal"/>
     <w:pPr>
@@ -2125,15 +2925,15 @@
     </w:pPr>
     <w:rPr/>
   </w:style>
-  <w:style w:type="paragraph" w:styleId="Lista">
+  <w:style w:type="paragraph" w:styleId="List">
     <w:name w:val="List"/>
-    <w:basedOn w:val="Cuerpodetexto"/>
+    <w:basedOn w:val="BodyText"/>
     <w:pPr/>
     <w:rPr>
       <w:rFonts w:cs="Noto Sans Devanagari"/>
     </w:rPr>
   </w:style>
-  <w:style w:type="paragraph" w:styleId="Leyenda">
+  <w:style w:type="paragraph" w:styleId="Caption">
     <w:name w:val="Caption"/>
     <w:basedOn w:val="Normal"/>
     <w:qFormat/>
@@ -2160,7 +2960,7 @@
       <w:rFonts w:cs="Noto Sans Devanagari"/>
     </w:rPr>
   </w:style>
-  <w:style w:type="paragraph" w:styleId="Ttulogeneral">
+  <w:style w:type="paragraph" w:styleId="Title">
     <w:name w:val="Title"/>
     <w:basedOn w:val="Normal"/>
     <w:next w:val="Normal"/>
@@ -2180,7 +2980,7 @@
       <w:szCs w:val="56"/>
     </w:rPr>
   </w:style>
-  <w:style w:type="paragraph" w:styleId="Subttulo">
+  <w:style w:type="paragraph" w:styleId="Subtitle">
     <w:name w:val="Subtitle"/>
     <w:basedOn w:val="Normal"/>
     <w:next w:val="Normal"/>
@@ -2191,7 +2991,7 @@
     <w:pPr/>
     <w:rPr>
       <w:rFonts w:eastAsia="" w:cs="" w:cstheme="majorBidi" w:eastAsiaTheme="majorEastAsia"/>
-      <w:color w:val="595959" w:themeColor="text1" w:themeTint="a6"/>
+      <w:color w:themeColor="text1" w:themeTint="a6" w:val="595959"/>
       <w:spacing w:val="15"/>
       <w:sz w:val="28"/>
       <w:szCs w:val="28"/>
@@ -2212,7 +3012,7 @@
     <w:rPr>
       <w:i/>
       <w:iCs/>
-      <w:color w:val="404040" w:themeColor="text1" w:themeTint="bf"/>
+      <w:color w:themeColor="text1" w:themeTint="bf" w:val="404040"/>
     </w:rPr>
   </w:style>
   <w:style w:type="paragraph" w:styleId="ListParagraph">
@@ -2223,7 +3023,7 @@
     <w:rsid w:val="00800f65"/>
     <w:pPr>
       <w:spacing w:before="0" w:after="160"/>
-      <w:ind w:left="720" w:hanging="0"/>
+      <w:ind w:hanging="0" w:left="720"/>
       <w:contextualSpacing/>
     </w:pPr>
     <w:rPr/>
@@ -2242,13 +3042,26 @@
         <w:bottom w:val="single" w:sz="4" w:space="10" w:color="0F4761"/>
       </w:pBdr>
       <w:spacing w:before="360" w:after="360"/>
-      <w:ind w:left="864" w:right="864" w:hanging="0"/>
+      <w:ind w:hanging="0" w:left="864" w:right="864"/>
       <w:jc w:val="center"/>
     </w:pPr>
     <w:rPr>
       <w:i/>
       <w:iCs/>
-      <w:color w:val="0F4761" w:themeColor="accent1" w:themeShade="bf"/>
+      <w:color w:themeColor="accent1" w:themeShade="bf" w:val="0F4761"/>
+    </w:rPr>
+  </w:style>
+  <w:style w:type="paragraph" w:styleId="Textopreformateado">
+    <w:name w:val="Texto preformateado"/>
+    <w:basedOn w:val="Normal"/>
+    <w:qFormat/>
+    <w:pPr>
+      <w:spacing w:before="0" w:after="0"/>
+    </w:pPr>
+    <w:rPr>
+      <w:rFonts w:ascii="Liberation Mono" w:hAnsi="Liberation Mono" w:eastAsia="Liberation Mono" w:cs="Liberation Mono"/>
+      <w:sz w:val="20"/>
+      <w:szCs w:val="20"/>
     </w:rPr>
   </w:style>
   <w:style w:type="numbering" w:styleId="NoList" w:default="1">
@@ -2295,195 +3108,97 @@
 </file>
 
 <file path=word/theme/theme1.xml><?xml version="1.0" encoding="utf-8"?>
-<a:theme xmlns:a="http://schemas.openxmlformats.org/drawingml/2006/main" name="Tema de Office">
+<a:theme xmlns:a="http://schemas.openxmlformats.org/drawingml/2006/main" xmlns:r="http://schemas.openxmlformats.org/officeDocument/2006/relationships" name="Tema de Office">
   <a:themeElements>
     <a:clrScheme name="Office">
       <a:dk1>
-        <a:sysClr val="windowText" lastClr="000000"/>
+        <a:srgbClr val="000000"/>
       </a:dk1>
       <a:lt1>
-        <a:sysClr val="window" lastClr="FFFFFF"/>
+        <a:srgbClr val="ffffff"/>
       </a:lt1>
       <a:dk2>
-        <a:srgbClr val="0E2841"/>
+        <a:srgbClr val="0e2841"/>
       </a:dk2>
       <a:lt2>
-        <a:srgbClr val="E8E8E8"/>
+        <a:srgbClr val="e8e8e8"/>
       </a:lt2>
       <a:accent1>
         <a:srgbClr val="156082"/>
       </a:accent1>
       <a:accent2>
-        <a:srgbClr val="E97132"/>
+        <a:srgbClr val="e97132"/>
       </a:accent2>
       <a:accent3>
-        <a:srgbClr val="196B24"/>
+        <a:srgbClr val="196b24"/>
       </a:accent3>
       <a:accent4>
-        <a:srgbClr val="0F9ED5"/>
+        <a:srgbClr val="0f9ed5"/>
       </a:accent4>
       <a:accent5>
-        <a:srgbClr val="A02B93"/>
+        <a:srgbClr val="a02b93"/>
       </a:accent5>
       <a:accent6>
-        <a:srgbClr val="4EA72E"/>
+        <a:srgbClr val="4ea72e"/>
       </a:accent6>
       <a:hlink>
         <a:srgbClr val="467886"/>
       </a:hlink>
       <a:folHlink>
-        <a:srgbClr val="96607D"/>
+        <a:srgbClr val="96607d"/>
       </a:folHlink>
     </a:clrScheme>
     <a:fontScheme name="Office">
       <a:majorFont>
-        <a:latin typeface="Aptos Display" panose="02110004020202020204"/>
+        <a:latin typeface="Aptos Display" panose="02110004020202020204" pitchFamily="0" charset="1"/>
         <a:ea typeface=""/>
         <a:cs typeface=""/>
-        <a:font script="Jpan" typeface="游ゴシック Light"/>
-        <a:font script="Hang" typeface="맑은 고딕"/>
-        <a:font script="Hans" typeface="等线 Light"/>
-        <a:font script="Hant" typeface="新細明體"/>
-        <a:font script="Arab" typeface="Times New Roman"/>
-        <a:font script="Hebr" typeface="Times New Roman"/>
-        <a:font script="Thai" typeface="Angsana New"/>
-        <a:font script="Ethi" typeface="Nyala"/>
-        <a:font script="Beng" typeface="Vrinda"/>
-        <a:font script="Gujr" typeface="Shruti"/>
-        <a:font script="Khmr" typeface="MoolBoran"/>
-        <a:font script="Knda" typeface="Tunga"/>
-        <a:font script="Guru" typeface="Raavi"/>
-        <a:font script="Cans" typeface="Euphemia"/>
-        <a:font script="Cher" typeface="Plantagenet Cherokee"/>
-        <a:font script="Yiii" typeface="Microsoft Yi Baiti"/>
-        <a:font script="Tibt" typeface="Microsoft Himalaya"/>
-        <a:font script="Thaa" typeface="MV Boli"/>
-        <a:font script="Deva" typeface="Mangal"/>
-        <a:font script="Telu" typeface="Gautami"/>
-        <a:font script="Taml" typeface="Latha"/>
-        <a:font script="Syrc" typeface="Estrangelo Edessa"/>
-        <a:font script="Orya" typeface="Kalinga"/>
-        <a:font script="Mlym" typeface="Kartika"/>
-        <a:font script="Laoo" typeface="DokChampa"/>
-        <a:font script="Sinh" typeface="Iskoola Pota"/>
-        <a:font script="Mong" typeface="Mongolian Baiti"/>
-        <a:font script="Viet" typeface="Times New Roman"/>
-        <a:font script="Uigh" typeface="Microsoft Uighur"/>
-        <a:font script="Geor" typeface="Sylfaen"/>
-        <a:font script="Armn" typeface="Arial"/>
-        <a:font script="Bugi" typeface="Leelawadee UI"/>
-        <a:font script="Bopo" typeface="Microsoft JhengHei"/>
-        <a:font script="Java" typeface="Javanese Text"/>
-        <a:font script="Lisu" typeface="Segoe UI"/>
-        <a:font script="Mymr" typeface="Myanmar Text"/>
-        <a:font script="Nkoo" typeface="Ebrima"/>
-        <a:font script="Olck" typeface="Nirmala UI"/>
-        <a:font script="Osma" typeface="Ebrima"/>
-        <a:font script="Phag" typeface="Phagspa"/>
-        <a:font script="Syrn" typeface="Estrangelo Edessa"/>
-        <a:font script="Syrj" typeface="Estrangelo Edessa"/>
-        <a:font script="Syre" typeface="Estrangelo Edessa"/>
-        <a:font script="Sora" typeface="Nirmala UI"/>
-        <a:font script="Tale" typeface="Microsoft Tai Le"/>
-        <a:font script="Talu" typeface="Microsoft New Tai Lue"/>
-        <a:font script="Tfng" typeface="Ebrima"/>
       </a:majorFont>
       <a:minorFont>
-        <a:latin typeface="Aptos" panose="02110004020202020204"/>
+        <a:latin typeface="Aptos" panose="02110004020202020204" pitchFamily="0" charset="1"/>
         <a:ea typeface=""/>
         <a:cs typeface=""/>
-        <a:font script="Jpan" typeface="游明朝"/>
-        <a:font script="Hang" typeface="맑은 고딕"/>
-        <a:font script="Hans" typeface="等线"/>
-        <a:font script="Hant" typeface="新細明體"/>
-        <a:font script="Arab" typeface="Arial"/>
-        <a:font script="Hebr" typeface="Arial"/>
-        <a:font script="Thai" typeface="Cordia New"/>
-        <a:font script="Ethi" typeface="Nyala"/>
-        <a:font script="Beng" typeface="Vrinda"/>
-        <a:font script="Gujr" typeface="Shruti"/>
-        <a:font script="Khmr" typeface="DaunPenh"/>
-        <a:font script="Knda" typeface="Tunga"/>
-        <a:font script="Guru" typeface="Raavi"/>
-        <a:font script="Cans" typeface="Euphemia"/>
-        <a:font script="Cher" typeface="Plantagenet Cherokee"/>
-        <a:font script="Yiii" typeface="Microsoft Yi Baiti"/>
-        <a:font script="Tibt" typeface="Microsoft Himalaya"/>
-        <a:font script="Thaa" typeface="MV Boli"/>
-        <a:font script="Deva" typeface="Mangal"/>
-        <a:font script="Telu" typeface="Gautami"/>
-        <a:font script="Taml" typeface="Latha"/>
-        <a:font script="Syrc" typeface="Estrangelo Edessa"/>
-        <a:font script="Orya" typeface="Kalinga"/>
-        <a:font script="Mlym" typeface="Kartika"/>
-        <a:font script="Laoo" typeface="DokChampa"/>
-        <a:font script="Sinh" typeface="Iskoola Pota"/>
-        <a:font script="Mong" typeface="Mongolian Baiti"/>
-        <a:font script="Viet" typeface="Arial"/>
-        <a:font script="Uigh" typeface="Microsoft Uighur"/>
-        <a:font script="Geor" typeface="Sylfaen"/>
-        <a:font script="Armn" typeface="Arial"/>
-        <a:font script="Bugi" typeface="Leelawadee UI"/>
-        <a:font script="Bopo" typeface="Microsoft JhengHei"/>
-        <a:font script="Java" typeface="Javanese Text"/>
-        <a:font script="Lisu" typeface="Segoe UI"/>
-        <a:font script="Mymr" typeface="Myanmar Text"/>
-        <a:font script="Nkoo" typeface="Ebrima"/>
-        <a:font script="Olck" typeface="Nirmala UI"/>
-        <a:font script="Osma" typeface="Ebrima"/>
-        <a:font script="Phag" typeface="Phagspa"/>
-        <a:font script="Syrn" typeface="Estrangelo Edessa"/>
-        <a:font script="Syrj" typeface="Estrangelo Edessa"/>
-        <a:font script="Syre" typeface="Estrangelo Edessa"/>
-        <a:font script="Sora" typeface="Nirmala UI"/>
-        <a:font script="Tale" typeface="Microsoft Tai Le"/>
-        <a:font script="Talu" typeface="Microsoft New Tai Lue"/>
-        <a:font script="Tfng" typeface="Ebrima"/>
       </a:minorFont>
     </a:fontScheme>
-    <a:fmtScheme name="Office">
+    <a:fmtScheme>
       <a:fillStyleLst>
         <a:solidFill>
           <a:schemeClr val="phClr"/>
         </a:solidFill>
-        <a:gradFill rotWithShape="1">
+        <a:gradFill>
           <a:gsLst>
             <a:gs pos="0">
               <a:schemeClr val="phClr">
                 <a:lumMod val="110000"/>
-                <a:satMod val="105000"/>
                 <a:tint val="67000"/>
               </a:schemeClr>
             </a:gs>
             <a:gs pos="50000">
               <a:schemeClr val="phClr">
                 <a:lumMod val="105000"/>
-                <a:satMod val="103000"/>
                 <a:tint val="73000"/>
               </a:schemeClr>
             </a:gs>
             <a:gs pos="100000">
               <a:schemeClr val="phClr">
                 <a:lumMod val="105000"/>
-                <a:satMod val="109000"/>
                 <a:tint val="81000"/>
               </a:schemeClr>
             </a:gs>
           </a:gsLst>
           <a:lin ang="5400000" scaled="0"/>
+          <a:tileRect l="0" t="0" r="0" b="0"/>
         </a:gradFill>
-        <a:gradFill rotWithShape="1">
+        <a:gradFill>
           <a:gsLst>
             <a:gs pos="0">
               <a:schemeClr val="phClr">
-                <a:satMod val="103000"/>
                 <a:lumMod val="102000"/>
                 <a:tint val="94000"/>
               </a:schemeClr>
             </a:gs>
             <a:gs pos="50000">
               <a:schemeClr val="phClr">
-                <a:satMod val="110000"/>
                 <a:lumMod val="100000"/>
                 <a:shade val="100000"/>
               </a:schemeClr>
@@ -2491,33 +3206,24 @@
             <a:gs pos="100000">
               <a:schemeClr val="phClr">
                 <a:lumMod val="99000"/>
-                <a:satMod val="120000"/>
                 <a:shade val="78000"/>
               </a:schemeClr>
             </a:gs>
           </a:gsLst>
           <a:lin ang="5400000" scaled="0"/>
+          <a:tileRect l="0" t="0" r="0" b="0"/>
         </a:gradFill>
       </a:fillStyleLst>
       <a:lnStyleLst>
         <a:ln w="12700" cap="flat" cmpd="sng" algn="ctr">
-          <a:solidFill>
-            <a:schemeClr val="phClr"/>
-          </a:solidFill>
           <a:prstDash val="solid"/>
           <a:miter lim="800000"/>
         </a:ln>
         <a:ln w="19050" cap="flat" cmpd="sng" algn="ctr">
-          <a:solidFill>
-            <a:schemeClr val="phClr"/>
-          </a:solidFill>
           <a:prstDash val="solid"/>
           <a:miter lim="800000"/>
         </a:ln>
         <a:ln w="25400" cap="flat" cmpd="sng" algn="ctr">
-          <a:solidFill>
-            <a:schemeClr val="phClr"/>
-          </a:solidFill>
           <a:prstDash val="solid"/>
           <a:miter lim="800000"/>
         </a:ln>
@@ -2530,13 +3236,7 @@
           <a:effectLst/>
         </a:effectStyle>
         <a:effectStyle>
-          <a:effectLst>
-            <a:outerShdw blurRad="57150" dist="19050" dir="5400000" algn="ctr" rotWithShape="0">
-              <a:srgbClr val="000000">
-                <a:alpha val="63000"/>
-              </a:srgbClr>
-            </a:outerShdw>
-          </a:effectLst>
+          <a:effectLst/>
         </a:effectStyle>
       </a:effectStyleLst>
       <a:bgFillStyleLst>
@@ -2546,15 +3246,13 @@
         <a:solidFill>
           <a:schemeClr val="phClr">
             <a:tint val="95000"/>
-            <a:satMod val="170000"/>
           </a:schemeClr>
         </a:solidFill>
-        <a:gradFill rotWithShape="1">
+        <a:gradFill>
           <a:gsLst>
             <a:gs pos="0">
               <a:schemeClr val="phClr">
                 <a:tint val="93000"/>
-                <a:satMod val="150000"/>
                 <a:shade val="98000"/>
                 <a:lumMod val="102000"/>
               </a:schemeClr>
@@ -2562,7 +3260,6 @@
             <a:gs pos="50000">
               <a:schemeClr val="phClr">
                 <a:tint val="98000"/>
-                <a:satMod val="130000"/>
                 <a:shade val="90000"/>
                 <a:lumMod val="103000"/>
               </a:schemeClr>
@@ -2570,41 +3267,14 @@
             <a:gs pos="100000">
               <a:schemeClr val="phClr">
                 <a:shade val="63000"/>
-                <a:satMod val="120000"/>
               </a:schemeClr>
             </a:gs>
           </a:gsLst>
           <a:lin ang="5400000" scaled="0"/>
+          <a:tileRect l="0" t="0" r="0" b="0"/>
         </a:gradFill>
       </a:bgFillStyleLst>
     </a:fmtScheme>
   </a:themeElements>
-  <a:objectDefaults>
-    <a:lnDef>
-      <a:spPr/>
-      <a:bodyPr/>
-      <a:lstStyle/>
-      <a:style>
-        <a:lnRef idx="2">
-          <a:schemeClr val="accent1"/>
-        </a:lnRef>
-        <a:fillRef idx="0">
-          <a:schemeClr val="accent1"/>
-        </a:fillRef>
-        <a:effectRef idx="1">
-          <a:schemeClr val="accent1"/>
-        </a:effectRef>
-        <a:fontRef idx="minor">
-          <a:schemeClr val="tx1"/>
-        </a:fontRef>
-      </a:style>
-    </a:lnDef>
-  </a:objectDefaults>
-  <a:extraClrSchemeLst/>
-  <a:extLst>
-    <a:ext uri="{05A4C25C-085E-4340-85A3-A5531E510DB2}">
-      <thm15:themeFamily xmlns:thm15="http://schemas.microsoft.com/office/thememl/2012/main" name="Office Theme" id="{2E142A2C-CD16-42D6-873A-C26D2A0506FA}" vid="{1BDDFF52-6CD6-40A5-AB3C-68EB2F1E4D0A}"/>
-    </a:ext>
-  </a:extLst>
 </a:theme>
 </file>
</xml_diff>